<commit_message>
Link the RCF Drive copies of books and guides first
The department's server is slow and often drops large downloads, so where a
Drive copy exists it is now the first link and the official link sits beside
it as "department copy" / "NIE copy".

- Drive copies: Grade 3, 6 and 9 Pupil's Books; Teachers' Guides for Grades
  3, 5, 6, 7, 9, 10, 11 and A/L General English
- Only files shared as "anyone with the link can view" are listed, except the
  Grade 5 guide, which the owner asked to publish while it is still editable
  by anyone with the link
- check-book-links.js now tests Drive links anonymously and reports a file
  that is not shared (a private file answers 401 with a sign-in page)

Co-Authored-By: Claude Opus 5 <noreply@anthropic.com>
</commit_message>
<xml_diff>
--- a/assets/downloads/teacher/rcf-english-textbooks-and-teacher-guides.docx
+++ b/assets/downloads/teacher/rcf-english-textbooks-and-teacher-guides.docx
@@ -32,7 +32,25 @@
         <w:pStyle w:val="Note"/>
       </w:pPr>
       <w:r>
-        <w:t xml:space="preserve">The books belong to the </w:t>
+        <w:t xml:space="preserve">These are the government's own books and guides. Where the link says </w:t>
+      </w:r>
+      <w:r>
+        <w:rPr>
+          <w:b/>
+        </w:rPr>
+        <w:t xml:space="preserve">department copy</w:t>
+      </w:r>
+      <w:r>
+        <w:t xml:space="preserve"> or </w:t>
+      </w:r>
+      <w:r>
+        <w:rPr>
+          <w:b/>
+        </w:rPr>
+        <w:t xml:space="preserve">NIE copy</w:t>
+      </w:r>
+      <w:r>
+        <w:t xml:space="preserve">, it goes to the official site: the books belong to the </w:t>
       </w:r>
       <w:r>
         <w:rPr>
@@ -50,7 +68,7 @@
         <w:t xml:space="preserve">National Institute of Education</w:t>
       </w:r>
       <w:r>
-        <w:t xml:space="preserve"> (nie.lk). We link to them; we do not keep copies here, and nothing on this page is an RCF publication.</w:t>
+        <w:t xml:space="preserve"> (nie.lk). Nothing on this page is an RCF publication.</w:t>
       </w:r>
     </w:p>
     <w:p>
@@ -58,7 +76,24 @@
         <w:pStyle w:val="Note"/>
       </w:pPr>
       <w:r>
-        <w:t xml:space="preserve">Every link was checked on 19 September 2026 and opened a PDF. The department's site has </w:t>
+        <w:t xml:space="preserve">The department's server is often slow and frequently stops a large download half way, so where we hold a copy in the </w:t>
+      </w:r>
+      <w:r>
+        <w:rPr>
+          <w:b/>
+        </w:rPr>
+        <w:t xml:space="preserve">RCF English Drive</w:t>
+      </w:r>
+      <w:r>
+        <w:t xml:space="preserve"> that is the first link, and the official link is kept beside it. The Drive copies are shared as view-only; if one will not open, use the official link.</w:t>
+      </w:r>
+    </w:p>
+    <w:p>
+      <w:pPr>
+        <w:pStyle w:val="Note"/>
+      </w:pPr>
+      <w:r>
+        <w:t xml:space="preserve">Every link here was checked and opened a PDF. The department's site has </w:t>
       </w:r>
       <w:r>
         <w:rPr>
@@ -435,6 +470,18 @@
               <w:rPr>
                 <w:sz w:val="18"/>
               </w:rPr>
+              <w:t xml:space="preserve"> (https://drive.google.com/file/d/1cPdUU3ghQO3gUmKXLWTY7X40FZtK_pyr/view)</w:t>
+            </w:r>
+            <w:r>
+              <w:t xml:space="preserve"> · </w:t>
+            </w:r>
+            <w:r>
+              <w:t xml:space="preserve">department copy</w:t>
+            </w:r>
+            <w:r>
+              <w:rPr>
+                <w:sz w:val="18"/>
+              </w:rPr>
               <w:t xml:space="preserve"> (http://www.edupub.gov.lk/Administrator/English/3/english%20PB%20G-3/english%20PB%20G-3.pdf)</w:t>
             </w:r>
           </w:p>
@@ -885,6 +932,18 @@
               <w:rPr>
                 <w:sz w:val="18"/>
               </w:rPr>
+              <w:t xml:space="preserve"> (https://drive.google.com/file/d/1Ta5sHpYrp23ywq4HugdEG1BrqB8tWCdl/view)</w:t>
+            </w:r>
+            <w:r>
+              <w:t xml:space="preserve"> · </w:t>
+            </w:r>
+            <w:r>
+              <w:t xml:space="preserve">department copy</w:t>
+            </w:r>
+            <w:r>
+              <w:rPr>
+                <w:sz w:val="18"/>
+              </w:rPr>
               <w:t xml:space="preserve"> (http://www.edupub.gov.lk/Administrator/English/6/english%20PB%20G-6/english%20PB%20G-6.pdf)</w:t>
             </w:r>
           </w:p>
@@ -1130,6 +1189,18 @@
             </w:pPr>
             <w:r>
               <w:t xml:space="preserve">Pupil's Book (PDF)</w:t>
+            </w:r>
+            <w:r>
+              <w:rPr>
+                <w:sz w:val="18"/>
+              </w:rPr>
+              <w:t xml:space="preserve"> (https://drive.google.com/file/d/16q5Qcc5jNowFBg-u04rAAXIEE1IgnouF/view)</w:t>
+            </w:r>
+            <w:r>
+              <w:t xml:space="preserve"> · </w:t>
+            </w:r>
+            <w:r>
+              <w:t xml:space="preserve">department copy</w:t>
             </w:r>
             <w:r>
               <w:rPr>
@@ -2731,6 +2802,18 @@
               <w:rPr>
                 <w:sz w:val="18"/>
               </w:rPr>
+              <w:t xml:space="preserve"> (https://drive.google.com/file/d/1tXItWDWlgtezo1J7bPx3uIx7m_RIDiCd/view)</w:t>
+            </w:r>
+            <w:r>
+              <w:t xml:space="preserve"> · </w:t>
+            </w:r>
+            <w:r>
+              <w:t xml:space="preserve">NIE copy</w:t>
+            </w:r>
+            <w:r>
+              <w:rPr>
+                <w:sz w:val="18"/>
+              </w:rPr>
               <w:t xml:space="preserve"> (https://nie.lk/pdffiles/tg/eGr03TG%20English.pdf)</w:t>
             </w:r>
           </w:p>
@@ -2781,6 +2864,18 @@
               <w:rPr>
                 <w:sz w:val="18"/>
               </w:rPr>
+              <w:t xml:space="preserve"> (https://drive.google.com/file/d/17C5Uf0i3mmePWXx2h1UpW0KaPAH7935R/view)</w:t>
+            </w:r>
+            <w:r>
+              <w:t xml:space="preserve"> · </w:t>
+            </w:r>
+            <w:r>
+              <w:t xml:space="preserve">NIE copy</w:t>
+            </w:r>
+            <w:r>
+              <w:rPr>
+                <w:sz w:val="18"/>
+              </w:rPr>
               <w:t xml:space="preserve"> (https://nie.lk/pdffiles/tg/eGr05TG%20English.pdf)</w:t>
             </w:r>
           </w:p>
@@ -2831,6 +2926,18 @@
               <w:rPr>
                 <w:sz w:val="18"/>
               </w:rPr>
+              <w:t xml:space="preserve"> (https://drive.google.com/file/d/1Spyt3mr2rXvh4-HwhjGEoAcx-u2r1FNi/view)</w:t>
+            </w:r>
+            <w:r>
+              <w:t xml:space="preserve"> · </w:t>
+            </w:r>
+            <w:r>
+              <w:t xml:space="preserve">NIE copy</w:t>
+            </w:r>
+            <w:r>
+              <w:rPr>
+                <w:sz w:val="18"/>
+              </w:rPr>
               <w:t xml:space="preserve"> (https://nie.lk/pdffiles/tg/e6tim107.pdf)</w:t>
             </w:r>
           </w:p>
@@ -2881,6 +2988,18 @@
               <w:rPr>
                 <w:sz w:val="18"/>
               </w:rPr>
+              <w:t xml:space="preserve"> (https://drive.google.com/file/d/1Mb4MlXQi6xdv3_Rg68PkzQ92MT4T4DCj/view)</w:t>
+            </w:r>
+            <w:r>
+              <w:t xml:space="preserve"> · </w:t>
+            </w:r>
+            <w:r>
+              <w:t xml:space="preserve">NIE copy</w:t>
+            </w:r>
+            <w:r>
+              <w:rPr>
+                <w:sz w:val="18"/>
+              </w:rPr>
               <w:t xml:space="preserve"> (https://nie.lk/pdffiles/tg/eGr07TG%20English.pdf)</w:t>
             </w:r>
           </w:p>
@@ -3031,6 +3150,18 @@
               <w:rPr>
                 <w:sz w:val="18"/>
               </w:rPr>
+              <w:t xml:space="preserve"> (https://drive.google.com/file/d/1V1sOydQCHmoJO-DfVEFn76-0kY6CbS8x/view)</w:t>
+            </w:r>
+            <w:r>
+              <w:t xml:space="preserve"> · </w:t>
+            </w:r>
+            <w:r>
+              <w:t xml:space="preserve">NIE copy</w:t>
+            </w:r>
+            <w:r>
+              <w:rPr>
+                <w:sz w:val="18"/>
+              </w:rPr>
               <w:t xml:space="preserve"> (https://nie.lk/pdffiles/tg/eGr09TG%20English.pdf)</w:t>
             </w:r>
           </w:p>
@@ -3131,6 +3262,18 @@
               <w:rPr>
                 <w:sz w:val="18"/>
               </w:rPr>
+              <w:t xml:space="preserve"> (https://drive.google.com/file/d/1miKnI4IFffmvJy0z22r-wu9fJOzoQXcA/view)</w:t>
+            </w:r>
+            <w:r>
+              <w:t xml:space="preserve"> · </w:t>
+            </w:r>
+            <w:r>
+              <w:t xml:space="preserve">NIE copy</w:t>
+            </w:r>
+            <w:r>
+              <w:rPr>
+                <w:sz w:val="18"/>
+              </w:rPr>
               <w:t xml:space="preserve"> (https://nie.lk/pdffiles/tg/e10tim107.pdf)</w:t>
             </w:r>
           </w:p>
@@ -3231,6 +3374,18 @@
               <w:rPr>
                 <w:sz w:val="18"/>
               </w:rPr>
+              <w:t xml:space="preserve"> (https://drive.google.com/file/d/1aFF9iR4m8ls6BprYXKM6yCZ17VUfhRuX/view)</w:t>
+            </w:r>
+            <w:r>
+              <w:t xml:space="preserve"> · </w:t>
+            </w:r>
+            <w:r>
+              <w:t xml:space="preserve">NIE copy</w:t>
+            </w:r>
+            <w:r>
+              <w:rPr>
+                <w:sz w:val="18"/>
+              </w:rPr>
               <w:t xml:space="preserve"> (https://nie.lk/pdffiles/tg/eGr11TG%20English.pdf)</w:t>
             </w:r>
           </w:p>
@@ -3276,6 +3431,18 @@
             </w:pPr>
             <w:r>
               <w:t xml:space="preserve">General English (2017) (PDF)</w:t>
+            </w:r>
+            <w:r>
+              <w:rPr>
+                <w:sz w:val="18"/>
+              </w:rPr>
+              <w:t xml:space="preserve"> (https://drive.google.com/file/d/0B5Dat0QJWfuUbkhpa0RHRWM4NXM/view?resourcekey=0-GkdNq03ksCxbWidqsa4H6Q)</w:t>
+            </w:r>
+            <w:r>
+              <w:t xml:space="preserve"> · </w:t>
+            </w:r>
+            <w:r>
+              <w:t xml:space="preserve">NIE copy</w:t>
             </w:r>
             <w:r>
               <w:rPr>
@@ -3635,7 +3802,7 @@
               <w:pStyle w:val="TableText"/>
             </w:pPr>
             <w:r>
-              <w:t xml:space="preserve">The department's download page has no books for Grades 12 and 13. The Teachers' Guide is on the NIE site.</w:t>
+              <w:t xml:space="preserve">The department's download page has no books for Grades 12 and 13. The Teachers' Guide is above.</w:t>
             </w:r>
           </w:p>
         </w:tc>

</xml_diff>

<commit_message>
Give every Drive book a direct download link
Each row with a Drive copy now offers Download (saves the PDF), read online
(opens it in Drive) and the official copy. Checked anonymously: all 11
downloads return PDF bytes with no Google virus-scan page, including the
22 MB Grade 3 book.

check-book-links.js now follows Drive's redirect to the file server, so a
download link is no longer reported as a failure.

Co-Authored-By: Claude Opus 5 <noreply@anthropic.com>
</commit_message>
<xml_diff>
--- a/assets/downloads/teacher/rcf-english-textbooks-and-teacher-guides.docx
+++ b/assets/downloads/teacher/rcf-english-textbooks-and-teacher-guides.docx
@@ -85,7 +85,25 @@
         <w:t xml:space="preserve">RCF English Drive</w:t>
       </w:r>
       <w:r>
-        <w:t xml:space="preserve"> that is the first link, and the official link is kept beside it. The Drive copies are shared as view-only; if one will not open, use the official link.</w:t>
+        <w:t xml:space="preserve"> that comes first. </w:t>
+      </w:r>
+      <w:r>
+        <w:rPr>
+          <w:b/>
+        </w:rPr>
+        <w:t xml:space="preserve">Download</w:t>
+      </w:r>
+      <w:r>
+        <w:t xml:space="preserve"> saves the PDF straight to your device; </w:t>
+      </w:r>
+      <w:r>
+        <w:rPr>
+          <w:b/>
+        </w:rPr>
+        <w:t xml:space="preserve">read online</w:t>
+      </w:r>
+      <w:r>
+        <w:t xml:space="preserve"> opens it in Google Drive without downloading; the official link is kept beside them. If one link will not open, use another.</w:t>
       </w:r>
     </w:p>
     <w:p>
@@ -164,9 +182,9 @@
         </w:tblCellMar>
       </w:tblPr>
       <w:tblGrid>
-        <w:gridCol w:w="898"/>
-        <w:gridCol w:w="4266"/>
-        <w:gridCol w:w="4942"/>
+        <w:gridCol w:w="769"/>
+        <w:gridCol w:w="3657"/>
+        <w:gridCol w:w="5680"/>
       </w:tblGrid>
       <w:tr>
         <w:trPr>
@@ -175,7 +193,7 @@
         </w:trPr>
         <w:tc>
           <w:tcPr>
-            <w:tcW w:w="898" w:type="dxa"/>
+            <w:tcW w:w="769" w:type="dxa"/>
             <w:shd w:val="clear" w:color="auto" w:fill="DCE6F2"/>
           </w:tcPr>
           <w:p>
@@ -192,7 +210,7 @@
         </w:tc>
         <w:tc>
           <w:tcPr>
-            <w:tcW w:w="4266" w:type="dxa"/>
+            <w:tcW w:w="3657" w:type="dxa"/>
             <w:shd w:val="clear" w:color="auto" w:fill="DCE6F2"/>
           </w:tcPr>
           <w:p>
@@ -209,7 +227,7 @@
         </w:tc>
         <w:tc>
           <w:tcPr>
-            <w:tcW w:w="4942" w:type="dxa"/>
+            <w:tcW w:w="5680" w:type="dxa"/>
             <w:shd w:val="clear" w:color="auto" w:fill="DCE6F2"/>
           </w:tcPr>
           <w:p>
@@ -231,7 +249,7 @@
         </w:trPr>
         <w:tc>
           <w:tcPr>
-            <w:tcW w:w="898" w:type="dxa"/>
+            <w:tcW w:w="769" w:type="dxa"/>
           </w:tcPr>
           <w:p>
             <w:pPr>
@@ -244,7 +262,7 @@
         </w:tc>
         <w:tc>
           <w:tcPr>
-            <w:tcW w:w="4266" w:type="dxa"/>
+            <w:tcW w:w="3657" w:type="dxa"/>
           </w:tcPr>
           <w:p>
             <w:pPr>
@@ -257,7 +275,7 @@
         </w:tc>
         <w:tc>
           <w:tcPr>
-            <w:tcW w:w="4942" w:type="dxa"/>
+            <w:tcW w:w="5680" w:type="dxa"/>
           </w:tcPr>
           <w:p>
             <w:pPr>
@@ -281,7 +299,7 @@
         </w:trPr>
         <w:tc>
           <w:tcPr>
-            <w:tcW w:w="898" w:type="dxa"/>
+            <w:tcW w:w="769" w:type="dxa"/>
           </w:tcPr>
           <w:p>
             <w:pPr>
@@ -294,7 +312,7 @@
         </w:tc>
         <w:tc>
           <w:tcPr>
-            <w:tcW w:w="4266" w:type="dxa"/>
+            <w:tcW w:w="3657" w:type="dxa"/>
           </w:tcPr>
           <w:p>
             <w:pPr>
@@ -307,7 +325,7 @@
         </w:tc>
         <w:tc>
           <w:tcPr>
-            <w:tcW w:w="4942" w:type="dxa"/>
+            <w:tcW w:w="5680" w:type="dxa"/>
           </w:tcPr>
           <w:p>
             <w:pPr>
@@ -331,7 +349,7 @@
         </w:trPr>
         <w:tc>
           <w:tcPr>
-            <w:tcW w:w="898" w:type="dxa"/>
+            <w:tcW w:w="769" w:type="dxa"/>
           </w:tcPr>
           <w:p>
             <w:pPr>
@@ -344,7 +362,7 @@
         </w:tc>
         <w:tc>
           <w:tcPr>
-            <w:tcW w:w="4266" w:type="dxa"/>
+            <w:tcW w:w="3657" w:type="dxa"/>
           </w:tcPr>
           <w:p>
             <w:pPr>
@@ -357,7 +375,7 @@
         </w:tc>
         <w:tc>
           <w:tcPr>
-            <w:tcW w:w="4942" w:type="dxa"/>
+            <w:tcW w:w="5680" w:type="dxa"/>
           </w:tcPr>
           <w:p>
             <w:pPr>
@@ -381,7 +399,7 @@
         </w:trPr>
         <w:tc>
           <w:tcPr>
-            <w:tcW w:w="898" w:type="dxa"/>
+            <w:tcW w:w="769" w:type="dxa"/>
           </w:tcPr>
           <w:p>
             <w:pPr>
@@ -394,7 +412,7 @@
         </w:tc>
         <w:tc>
           <w:tcPr>
-            <w:tcW w:w="4266" w:type="dxa"/>
+            <w:tcW w:w="3657" w:type="dxa"/>
           </w:tcPr>
           <w:p>
             <w:pPr>
@@ -407,7 +425,7 @@
         </w:tc>
         <w:tc>
           <w:tcPr>
-            <w:tcW w:w="4942" w:type="dxa"/>
+            <w:tcW w:w="5680" w:type="dxa"/>
           </w:tcPr>
           <w:p>
             <w:pPr>
@@ -431,7 +449,7 @@
         </w:trPr>
         <w:tc>
           <w:tcPr>
-            <w:tcW w:w="898" w:type="dxa"/>
+            <w:tcW w:w="769" w:type="dxa"/>
           </w:tcPr>
           <w:p>
             <w:pPr>
@@ -444,7 +462,7 @@
         </w:tc>
         <w:tc>
           <w:tcPr>
-            <w:tcW w:w="4266" w:type="dxa"/>
+            <w:tcW w:w="3657" w:type="dxa"/>
           </w:tcPr>
           <w:p>
             <w:pPr>
@@ -457,7 +475,181 @@
         </w:tc>
         <w:tc>
           <w:tcPr>
-            <w:tcW w:w="4942" w:type="dxa"/>
+            <w:tcW w:w="5680" w:type="dxa"/>
+          </w:tcPr>
+          <w:p>
+            <w:pPr>
+              <w:pStyle w:val="TableText"/>
+            </w:pPr>
+            <w:r>
+              <w:t xml:space="preserve">Download Pupil's Book (PDF)</w:t>
+            </w:r>
+            <w:r>
+              <w:rPr>
+                <w:sz w:val="18"/>
+              </w:rPr>
+              <w:t xml:space="preserve"> (https://drive.google.com/uc?export=download&amp;id=1cPdUU3ghQO3gUmKXLWTY7X40FZtK_pyr)</w:t>
+            </w:r>
+            <w:r>
+              <w:t xml:space="preserve"> · </w:t>
+            </w:r>
+            <w:r>
+              <w:t xml:space="preserve">read online</w:t>
+            </w:r>
+            <w:r>
+              <w:rPr>
+                <w:sz w:val="18"/>
+              </w:rPr>
+              <w:t xml:space="preserve"> (https://drive.google.com/file/d/1cPdUU3ghQO3gUmKXLWTY7X40FZtK_pyr/view)</w:t>
+            </w:r>
+            <w:r>
+              <w:t xml:space="preserve"> · </w:t>
+            </w:r>
+            <w:r>
+              <w:t xml:space="preserve">department copy</w:t>
+            </w:r>
+            <w:r>
+              <w:rPr>
+                <w:sz w:val="18"/>
+              </w:rPr>
+              <w:t xml:space="preserve"> (http://www.edupub.gov.lk/Administrator/English/3/english%20PB%20G-3/english%20PB%20G-3.pdf)</w:t>
+            </w:r>
+          </w:p>
+        </w:tc>
+      </w:tr>
+      <w:tr>
+        <w:trPr>
+          <w:cantSplit/>
+        </w:trPr>
+        <w:tc>
+          <w:tcPr>
+            <w:tcW w:w="769" w:type="dxa"/>
+          </w:tcPr>
+          <w:p>
+            <w:pPr>
+              <w:pStyle w:val="TableText"/>
+            </w:pPr>
+            <w:r>
+              <w:t xml:space="preserve">Grade 3</w:t>
+            </w:r>
+          </w:p>
+        </w:tc>
+        <w:tc>
+          <w:tcPr>
+            <w:tcW w:w="3657" w:type="dxa"/>
+          </w:tcPr>
+          <w:p>
+            <w:pPr>
+              <w:pStyle w:val="TableText"/>
+            </w:pPr>
+            <w:r>
+              <w:t xml:space="preserve">Workbook</w:t>
+            </w:r>
+          </w:p>
+        </w:tc>
+        <w:tc>
+          <w:tcPr>
+            <w:tcW w:w="5680" w:type="dxa"/>
+          </w:tcPr>
+          <w:p>
+            <w:pPr>
+              <w:pStyle w:val="TableText"/>
+            </w:pPr>
+            <w:r>
+              <w:t xml:space="preserve">Workbook (PDF)</w:t>
+            </w:r>
+            <w:r>
+              <w:rPr>
+                <w:sz w:val="18"/>
+              </w:rPr>
+              <w:t xml:space="preserve"> (http://www.edupub.gov.lk/Administrator/English/3/english%20wb%20G-3/english%20WB.%203.pdf)</w:t>
+            </w:r>
+          </w:p>
+        </w:tc>
+      </w:tr>
+      <w:tr>
+        <w:trPr>
+          <w:cantSplit/>
+        </w:trPr>
+        <w:tc>
+          <w:tcPr>
+            <w:tcW w:w="769" w:type="dxa"/>
+          </w:tcPr>
+          <w:p>
+            <w:pPr>
+              <w:pStyle w:val="TableText"/>
+            </w:pPr>
+            <w:r>
+              <w:t xml:space="preserve">Grade 3</w:t>
+            </w:r>
+          </w:p>
+        </w:tc>
+        <w:tc>
+          <w:tcPr>
+            <w:tcW w:w="3657" w:type="dxa"/>
+          </w:tcPr>
+          <w:p>
+            <w:pPr>
+              <w:pStyle w:val="TableText"/>
+            </w:pPr>
+            <w:r>
+              <w:t xml:space="preserve">Writing Practice book</w:t>
+            </w:r>
+          </w:p>
+        </w:tc>
+        <w:tc>
+          <w:tcPr>
+            <w:tcW w:w="5680" w:type="dxa"/>
+          </w:tcPr>
+          <w:p>
+            <w:pPr>
+              <w:pStyle w:val="TableText"/>
+            </w:pPr>
+            <w:r>
+              <w:t xml:space="preserve">Writing Practice book (PDF)</w:t>
+            </w:r>
+            <w:r>
+              <w:rPr>
+                <w:sz w:val="18"/>
+              </w:rPr>
+              <w:t xml:space="preserve"> (http://www.edupub.gov.lk/Administrator/English/3/en%20writing%20prac%20G-3/26454%20-%20SB%20Writing%20Practice%20Grade%203%20English.pdf)</w:t>
+            </w:r>
+          </w:p>
+        </w:tc>
+      </w:tr>
+      <w:tr>
+        <w:trPr>
+          <w:cantSplit/>
+        </w:trPr>
+        <w:tc>
+          <w:tcPr>
+            <w:tcW w:w="769" w:type="dxa"/>
+          </w:tcPr>
+          <w:p>
+            <w:pPr>
+              <w:pStyle w:val="TableText"/>
+            </w:pPr>
+            <w:r>
+              <w:t xml:space="preserve">Grade 4</w:t>
+            </w:r>
+          </w:p>
+        </w:tc>
+        <w:tc>
+          <w:tcPr>
+            <w:tcW w:w="3657" w:type="dxa"/>
+          </w:tcPr>
+          <w:p>
+            <w:pPr>
+              <w:pStyle w:val="TableText"/>
+            </w:pPr>
+            <w:r>
+              <w:t xml:space="preserve">Pupil's Book</w:t>
+            </w:r>
+          </w:p>
+        </w:tc>
+        <w:tc>
+          <w:tcPr>
+            <w:tcW w:w="5680" w:type="dxa"/>
           </w:tcPr>
           <w:p>
             <w:pPr>
@@ -470,43 +662,355 @@
               <w:rPr>
                 <w:sz w:val="18"/>
               </w:rPr>
-              <w:t xml:space="preserve"> (https://drive.google.com/file/d/1cPdUU3ghQO3gUmKXLWTY7X40FZtK_pyr/view)</w:t>
+              <w:t xml:space="preserve"> (http://www.edupub.gov.lk/Administrator/English/4/en%20pb%20G-4/english%20PB%20G-4.pdf)</w:t>
+            </w:r>
+          </w:p>
+        </w:tc>
+      </w:tr>
+      <w:tr>
+        <w:trPr>
+          <w:cantSplit/>
+        </w:trPr>
+        <w:tc>
+          <w:tcPr>
+            <w:tcW w:w="769" w:type="dxa"/>
+          </w:tcPr>
+          <w:p>
+            <w:pPr>
+              <w:pStyle w:val="TableText"/>
+            </w:pPr>
+            <w:r>
+              <w:t xml:space="preserve">Grade 4</w:t>
+            </w:r>
+          </w:p>
+        </w:tc>
+        <w:tc>
+          <w:tcPr>
+            <w:tcW w:w="3657" w:type="dxa"/>
+          </w:tcPr>
+          <w:p>
+            <w:pPr>
+              <w:pStyle w:val="TableText"/>
+            </w:pPr>
+            <w:r>
+              <w:t xml:space="preserve">Workbook</w:t>
+            </w:r>
+          </w:p>
+        </w:tc>
+        <w:tc>
+          <w:tcPr>
+            <w:tcW w:w="5680" w:type="dxa"/>
+          </w:tcPr>
+          <w:p>
+            <w:pPr>
+              <w:pStyle w:val="TableText"/>
+            </w:pPr>
+            <w:r>
+              <w:t xml:space="preserve">Workbook (PDF)</w:t>
+            </w:r>
+            <w:r>
+              <w:rPr>
+                <w:sz w:val="18"/>
+              </w:rPr>
+              <w:t xml:space="preserve"> (http://www.edupub.gov.lk/Administrator/English/4/english%20WB%20G-4/english%20WB%20G-4.pdf)</w:t>
+            </w:r>
+          </w:p>
+        </w:tc>
+      </w:tr>
+      <w:tr>
+        <w:trPr>
+          <w:cantSplit/>
+        </w:trPr>
+        <w:tc>
+          <w:tcPr>
+            <w:tcW w:w="769" w:type="dxa"/>
+          </w:tcPr>
+          <w:p>
+            <w:pPr>
+              <w:pStyle w:val="TableText"/>
+            </w:pPr>
+            <w:r>
+              <w:t xml:space="preserve">Grade 5</w:t>
+            </w:r>
+          </w:p>
+        </w:tc>
+        <w:tc>
+          <w:tcPr>
+            <w:tcW w:w="3657" w:type="dxa"/>
+          </w:tcPr>
+          <w:p>
+            <w:pPr>
+              <w:pStyle w:val="TableText"/>
+            </w:pPr>
+            <w:r>
+              <w:t xml:space="preserve">Pupil's Book</w:t>
+            </w:r>
+          </w:p>
+        </w:tc>
+        <w:tc>
+          <w:tcPr>
+            <w:tcW w:w="5680" w:type="dxa"/>
+          </w:tcPr>
+          <w:p>
+            <w:pPr>
+              <w:pStyle w:val="TableText"/>
+            </w:pPr>
+            <w:r>
+              <w:t xml:space="preserve">Pupil's Book (PDF)</w:t>
+            </w:r>
+            <w:r>
+              <w:rPr>
+                <w:sz w:val="18"/>
+              </w:rPr>
+              <w:t xml:space="preserve"> (http://www.edupub.gov.lk/Administrator/English/5/english%20pb%20G-5/English%20PB%20G-5.pdf)</w:t>
+            </w:r>
+          </w:p>
+        </w:tc>
+      </w:tr>
+      <w:tr>
+        <w:trPr>
+          <w:cantSplit/>
+        </w:trPr>
+        <w:tc>
+          <w:tcPr>
+            <w:tcW w:w="769" w:type="dxa"/>
+          </w:tcPr>
+          <w:p>
+            <w:pPr>
+              <w:pStyle w:val="TableText"/>
+            </w:pPr>
+            <w:r>
+              <w:t xml:space="preserve">Grade 5</w:t>
+            </w:r>
+          </w:p>
+        </w:tc>
+        <w:tc>
+          <w:tcPr>
+            <w:tcW w:w="3657" w:type="dxa"/>
+          </w:tcPr>
+          <w:p>
+            <w:pPr>
+              <w:pStyle w:val="TableText"/>
+            </w:pPr>
+            <w:r>
+              <w:t xml:space="preserve">Workbook</w:t>
+            </w:r>
+          </w:p>
+        </w:tc>
+        <w:tc>
+          <w:tcPr>
+            <w:tcW w:w="5680" w:type="dxa"/>
+          </w:tcPr>
+          <w:p>
+            <w:pPr>
+              <w:pStyle w:val="TableText"/>
+            </w:pPr>
+            <w:r>
+              <w:t xml:space="preserve">Workbook (PDF)</w:t>
+            </w:r>
+            <w:r>
+              <w:rPr>
+                <w:sz w:val="18"/>
+              </w:rPr>
+              <w:t xml:space="preserve"> (http://www.edupub.gov.lk/Administrator/English/5/english%20WB%20G-5/english%20G-5%20WB.pdf)</w:t>
+            </w:r>
+          </w:p>
+        </w:tc>
+      </w:tr>
+      <w:tr>
+        <w:trPr>
+          <w:cantSplit/>
+        </w:trPr>
+        <w:tc>
+          <w:tcPr>
+            <w:tcW w:w="769" w:type="dxa"/>
+          </w:tcPr>
+          <w:p>
+            <w:pPr>
+              <w:pStyle w:val="TableText"/>
+            </w:pPr>
+            <w:r>
+              <w:t xml:space="preserve">Grade 5</w:t>
+            </w:r>
+          </w:p>
+        </w:tc>
+        <w:tc>
+          <w:tcPr>
+            <w:tcW w:w="3657" w:type="dxa"/>
+          </w:tcPr>
+          <w:p>
+            <w:pPr>
+              <w:pStyle w:val="TableText"/>
+            </w:pPr>
+            <w:r>
+              <w:t xml:space="preserve">Workbook Part I (earlier edition)</w:t>
+            </w:r>
+          </w:p>
+        </w:tc>
+        <w:tc>
+          <w:tcPr>
+            <w:tcW w:w="5680" w:type="dxa"/>
+          </w:tcPr>
+          <w:p>
+            <w:pPr>
+              <w:pStyle w:val="TableText"/>
+            </w:pPr>
+            <w:r>
+              <w:t xml:space="preserve">Workbook Part I (earlier edition) (PDF)</w:t>
+            </w:r>
+            <w:r>
+              <w:rPr>
+                <w:sz w:val="18"/>
+              </w:rPr>
+              <w:t xml:space="preserve"> (http://www.edupub.gov.lk/Administrator/English/5/english%20wb%20G-5%20P-I/English%20WB%20Gra.-5%20Part-I.pdf)</w:t>
+            </w:r>
+          </w:p>
+        </w:tc>
+      </w:tr>
+      <w:tr>
+        <w:trPr>
+          <w:cantSplit/>
+        </w:trPr>
+        <w:tc>
+          <w:tcPr>
+            <w:tcW w:w="769" w:type="dxa"/>
+          </w:tcPr>
+          <w:p>
+            <w:pPr>
+              <w:pStyle w:val="TableText"/>
+            </w:pPr>
+            <w:r>
+              <w:t xml:space="preserve">Grade 5</w:t>
+            </w:r>
+          </w:p>
+        </w:tc>
+        <w:tc>
+          <w:tcPr>
+            <w:tcW w:w="3657" w:type="dxa"/>
+          </w:tcPr>
+          <w:p>
+            <w:pPr>
+              <w:pStyle w:val="TableText"/>
+            </w:pPr>
+            <w:r>
+              <w:t xml:space="preserve">Workbook Part II (earlier edition)</w:t>
+            </w:r>
+          </w:p>
+        </w:tc>
+        <w:tc>
+          <w:tcPr>
+            <w:tcW w:w="5680" w:type="dxa"/>
+          </w:tcPr>
+          <w:p>
+            <w:pPr>
+              <w:pStyle w:val="TableText"/>
+            </w:pPr>
+            <w:r>
+              <w:t xml:space="preserve">Workbook Part II (earlier edition) (PDF)</w:t>
+            </w:r>
+            <w:r>
+              <w:rPr>
+                <w:sz w:val="18"/>
+              </w:rPr>
+              <w:t xml:space="preserve"> (http://www.edupub.gov.lk/Administrator/English/5/english%20wb%20G-5%20P-II/English%20WB%20Gra.-5%20Part%20-II.pdf)</w:t>
+            </w:r>
+          </w:p>
+        </w:tc>
+      </w:tr>
+      <w:tr>
+        <w:trPr>
+          <w:cantSplit/>
+        </w:trPr>
+        <w:tc>
+          <w:tcPr>
+            <w:tcW w:w="769" w:type="dxa"/>
+          </w:tcPr>
+          <w:p>
+            <w:pPr>
+              <w:pStyle w:val="TableText"/>
+            </w:pPr>
+            <w:r>
+              <w:t xml:space="preserve">Grade 6</w:t>
+            </w:r>
+          </w:p>
+        </w:tc>
+        <w:tc>
+          <w:tcPr>
+            <w:tcW w:w="3657" w:type="dxa"/>
+          </w:tcPr>
+          <w:p>
+            <w:pPr>
+              <w:pStyle w:val="TableText"/>
+            </w:pPr>
+            <w:r>
+              <w:t xml:space="preserve">Pupil's Book</w:t>
+            </w:r>
+          </w:p>
+        </w:tc>
+        <w:tc>
+          <w:tcPr>
+            <w:tcW w:w="5680" w:type="dxa"/>
+          </w:tcPr>
+          <w:p>
+            <w:pPr>
+              <w:pStyle w:val="TableText"/>
+            </w:pPr>
+            <w:r>
+              <w:t xml:space="preserve">Download Pupil's Book (PDF)</w:t>
+            </w:r>
+            <w:r>
+              <w:rPr>
+                <w:sz w:val="18"/>
+              </w:rPr>
+              <w:t xml:space="preserve"> (https://drive.google.com/uc?export=download&amp;id=1Ta5sHpYrp23ywq4HugdEG1BrqB8tWCdl)</w:t>
             </w:r>
             <w:r>
               <w:t xml:space="preserve"> · </w:t>
             </w:r>
             <w:r>
+              <w:t xml:space="preserve">read online</w:t>
+            </w:r>
+            <w:r>
+              <w:rPr>
+                <w:sz w:val="18"/>
+              </w:rPr>
+              <w:t xml:space="preserve"> (https://drive.google.com/file/d/1Ta5sHpYrp23ywq4HugdEG1BrqB8tWCdl/view)</w:t>
+            </w:r>
+            <w:r>
+              <w:t xml:space="preserve"> · </w:t>
+            </w:r>
+            <w:r>
               <w:t xml:space="preserve">department copy</w:t>
             </w:r>
             <w:r>
               <w:rPr>
                 <w:sz w:val="18"/>
               </w:rPr>
-              <w:t xml:space="preserve"> (http://www.edupub.gov.lk/Administrator/English/3/english%20PB%20G-3/english%20PB%20G-3.pdf)</w:t>
-            </w:r>
-          </w:p>
-        </w:tc>
-      </w:tr>
-      <w:tr>
-        <w:trPr>
-          <w:cantSplit/>
-        </w:trPr>
-        <w:tc>
-          <w:tcPr>
-            <w:tcW w:w="898" w:type="dxa"/>
-          </w:tcPr>
-          <w:p>
-            <w:pPr>
-              <w:pStyle w:val="TableText"/>
-            </w:pPr>
-            <w:r>
-              <w:t xml:space="preserve">Grade 3</w:t>
-            </w:r>
-          </w:p>
-        </w:tc>
-        <w:tc>
-          <w:tcPr>
-            <w:tcW w:w="4266" w:type="dxa"/>
+              <w:t xml:space="preserve"> (http://www.edupub.gov.lk/Administrator/English/6/english%20PB%20G-6/english%20PB%20G-6.pdf)</w:t>
+            </w:r>
+          </w:p>
+        </w:tc>
+      </w:tr>
+      <w:tr>
+        <w:trPr>
+          <w:cantSplit/>
+        </w:trPr>
+        <w:tc>
+          <w:tcPr>
+            <w:tcW w:w="769" w:type="dxa"/>
+          </w:tcPr>
+          <w:p>
+            <w:pPr>
+              <w:pStyle w:val="TableText"/>
+            </w:pPr>
+            <w:r>
+              <w:t xml:space="preserve">Grade 6</w:t>
+            </w:r>
+          </w:p>
+        </w:tc>
+        <w:tc>
+          <w:tcPr>
+            <w:tcW w:w="3657" w:type="dxa"/>
           </w:tcPr>
           <w:p>
             <w:pPr>
@@ -519,7 +1023,7 @@
         </w:tc>
         <w:tc>
           <w:tcPr>
-            <w:tcW w:w="4942" w:type="dxa"/>
+            <w:tcW w:w="5680" w:type="dxa"/>
           </w:tcPr>
           <w:p>
             <w:pPr>
@@ -532,81 +1036,81 @@
               <w:rPr>
                 <w:sz w:val="18"/>
               </w:rPr>
-              <w:t xml:space="preserve"> (http://www.edupub.gov.lk/Administrator/English/3/english%20wb%20G-3/english%20WB.%203.pdf)</w:t>
-            </w:r>
-          </w:p>
-        </w:tc>
-      </w:tr>
-      <w:tr>
-        <w:trPr>
-          <w:cantSplit/>
-        </w:trPr>
-        <w:tc>
-          <w:tcPr>
-            <w:tcW w:w="898" w:type="dxa"/>
-          </w:tcPr>
-          <w:p>
-            <w:pPr>
-              <w:pStyle w:val="TableText"/>
-            </w:pPr>
-            <w:r>
-              <w:t xml:space="preserve">Grade 3</w:t>
-            </w:r>
-          </w:p>
-        </w:tc>
-        <w:tc>
-          <w:tcPr>
-            <w:tcW w:w="4266" w:type="dxa"/>
-          </w:tcPr>
-          <w:p>
-            <w:pPr>
-              <w:pStyle w:val="TableText"/>
-            </w:pPr>
-            <w:r>
-              <w:t xml:space="preserve">Writing Practice book</w:t>
-            </w:r>
-          </w:p>
-        </w:tc>
-        <w:tc>
-          <w:tcPr>
-            <w:tcW w:w="4942" w:type="dxa"/>
-          </w:tcPr>
-          <w:p>
-            <w:pPr>
-              <w:pStyle w:val="TableText"/>
-            </w:pPr>
-            <w:r>
-              <w:t xml:space="preserve">Writing Practice book (PDF)</w:t>
-            </w:r>
-            <w:r>
-              <w:rPr>
-                <w:sz w:val="18"/>
-              </w:rPr>
-              <w:t xml:space="preserve"> (http://www.edupub.gov.lk/Administrator/English/3/en%20writing%20prac%20G-3/26454%20-%20SB%20Writing%20Practice%20Grade%203%20English.pdf)</w:t>
-            </w:r>
-          </w:p>
-        </w:tc>
-      </w:tr>
-      <w:tr>
-        <w:trPr>
-          <w:cantSplit/>
-        </w:trPr>
-        <w:tc>
-          <w:tcPr>
-            <w:tcW w:w="898" w:type="dxa"/>
-          </w:tcPr>
-          <w:p>
-            <w:pPr>
-              <w:pStyle w:val="TableText"/>
-            </w:pPr>
-            <w:r>
-              <w:t xml:space="preserve">Grade 4</w:t>
-            </w:r>
-          </w:p>
-        </w:tc>
-        <w:tc>
-          <w:tcPr>
-            <w:tcW w:w="4266" w:type="dxa"/>
+              <w:t xml:space="preserve"> (http://www.edupub.gov.lk/Administrator/English/6/english%20wb%20G-6/A94779_ENGLISH%20WORKBOOK%20-%20GRADE%2006.pdf)</w:t>
+            </w:r>
+          </w:p>
+        </w:tc>
+      </w:tr>
+      <w:tr>
+        <w:trPr>
+          <w:cantSplit/>
+        </w:trPr>
+        <w:tc>
+          <w:tcPr>
+            <w:tcW w:w="769" w:type="dxa"/>
+          </w:tcPr>
+          <w:p>
+            <w:pPr>
+              <w:pStyle w:val="TableText"/>
+            </w:pPr>
+            <w:r>
+              <w:t xml:space="preserve">Grade 7</w:t>
+            </w:r>
+          </w:p>
+        </w:tc>
+        <w:tc>
+          <w:tcPr>
+            <w:tcW w:w="3657" w:type="dxa"/>
+          </w:tcPr>
+          <w:p>
+            <w:pPr>
+              <w:pStyle w:val="TableText"/>
+            </w:pPr>
+            <w:r>
+              <w:t xml:space="preserve">Workbook</w:t>
+            </w:r>
+          </w:p>
+        </w:tc>
+        <w:tc>
+          <w:tcPr>
+            <w:tcW w:w="5680" w:type="dxa"/>
+          </w:tcPr>
+          <w:p>
+            <w:pPr>
+              <w:pStyle w:val="TableText"/>
+            </w:pPr>
+            <w:r>
+              <w:t xml:space="preserve">Workbook (PDF)</w:t>
+            </w:r>
+            <w:r>
+              <w:rPr>
+                <w:sz w:val="18"/>
+              </w:rPr>
+              <w:t xml:space="preserve"> (http://www.edupub.gov.lk/Administrator/English/7/en%20wb%20g-7/en%20WB%20G-7.pdf)</w:t>
+            </w:r>
+          </w:p>
+        </w:tc>
+      </w:tr>
+      <w:tr>
+        <w:trPr>
+          <w:cantSplit/>
+        </w:trPr>
+        <w:tc>
+          <w:tcPr>
+            <w:tcW w:w="769" w:type="dxa"/>
+          </w:tcPr>
+          <w:p>
+            <w:pPr>
+              <w:pStyle w:val="TableText"/>
+            </w:pPr>
+            <w:r>
+              <w:t xml:space="preserve">Grade 8</w:t>
+            </w:r>
+          </w:p>
+        </w:tc>
+        <w:tc>
+          <w:tcPr>
+            <w:tcW w:w="3657" w:type="dxa"/>
           </w:tcPr>
           <w:p>
             <w:pPr>
@@ -619,7 +1123,7 @@
         </w:tc>
         <w:tc>
           <w:tcPr>
-            <w:tcW w:w="4942" w:type="dxa"/>
+            <w:tcW w:w="5680" w:type="dxa"/>
           </w:tcPr>
           <w:p>
             <w:pPr>
@@ -632,31 +1136,31 @@
               <w:rPr>
                 <w:sz w:val="18"/>
               </w:rPr>
-              <w:t xml:space="preserve"> (http://www.edupub.gov.lk/Administrator/English/4/en%20pb%20G-4/english%20PB%20G-4.pdf)</w:t>
-            </w:r>
-          </w:p>
-        </w:tc>
-      </w:tr>
-      <w:tr>
-        <w:trPr>
-          <w:cantSplit/>
-        </w:trPr>
-        <w:tc>
-          <w:tcPr>
-            <w:tcW w:w="898" w:type="dxa"/>
-          </w:tcPr>
-          <w:p>
-            <w:pPr>
-              <w:pStyle w:val="TableText"/>
-            </w:pPr>
-            <w:r>
-              <w:t xml:space="preserve">Grade 4</w:t>
-            </w:r>
-          </w:p>
-        </w:tc>
-        <w:tc>
-          <w:tcPr>
-            <w:tcW w:w="4266" w:type="dxa"/>
+              <w:t xml:space="preserve"> (http://www.edupub.gov.lk/Administrator/English/8/en%20pb%20g-8/en%20PB%20g-8.pdf)</w:t>
+            </w:r>
+          </w:p>
+        </w:tc>
+      </w:tr>
+      <w:tr>
+        <w:trPr>
+          <w:cantSplit/>
+        </w:trPr>
+        <w:tc>
+          <w:tcPr>
+            <w:tcW w:w="769" w:type="dxa"/>
+          </w:tcPr>
+          <w:p>
+            <w:pPr>
+              <w:pStyle w:val="TableText"/>
+            </w:pPr>
+            <w:r>
+              <w:t xml:space="preserve">Grade 8</w:t>
+            </w:r>
+          </w:p>
+        </w:tc>
+        <w:tc>
+          <w:tcPr>
+            <w:tcW w:w="3657" w:type="dxa"/>
           </w:tcPr>
           <w:p>
             <w:pPr>
@@ -669,7 +1173,7 @@
         </w:tc>
         <w:tc>
           <w:tcPr>
-            <w:tcW w:w="4942" w:type="dxa"/>
+            <w:tcW w:w="5680" w:type="dxa"/>
           </w:tcPr>
           <w:p>
             <w:pPr>
@@ -682,31 +1186,31 @@
               <w:rPr>
                 <w:sz w:val="18"/>
               </w:rPr>
-              <w:t xml:space="preserve"> (http://www.edupub.gov.lk/Administrator/English/4/english%20WB%20G-4/english%20WB%20G-4.pdf)</w:t>
-            </w:r>
-          </w:p>
-        </w:tc>
-      </w:tr>
-      <w:tr>
-        <w:trPr>
-          <w:cantSplit/>
-        </w:trPr>
-        <w:tc>
-          <w:tcPr>
-            <w:tcW w:w="898" w:type="dxa"/>
-          </w:tcPr>
-          <w:p>
-            <w:pPr>
-              <w:pStyle w:val="TableText"/>
-            </w:pPr>
-            <w:r>
-              <w:t xml:space="preserve">Grade 5</w:t>
-            </w:r>
-          </w:p>
-        </w:tc>
-        <w:tc>
-          <w:tcPr>
-            <w:tcW w:w="4266" w:type="dxa"/>
+              <w:t xml:space="preserve"> (http://www.edupub.gov.lk/Administrator/English/8/en%20wb%20g-8/english%20WB%20g-8.pdf)</w:t>
+            </w:r>
+          </w:p>
+        </w:tc>
+      </w:tr>
+      <w:tr>
+        <w:trPr>
+          <w:cantSplit/>
+        </w:trPr>
+        <w:tc>
+          <w:tcPr>
+            <w:tcW w:w="769" w:type="dxa"/>
+          </w:tcPr>
+          <w:p>
+            <w:pPr>
+              <w:pStyle w:val="TableText"/>
+            </w:pPr>
+            <w:r>
+              <w:t xml:space="preserve">Grade 9</w:t>
+            </w:r>
+          </w:p>
+        </w:tc>
+        <w:tc>
+          <w:tcPr>
+            <w:tcW w:w="3657" w:type="dxa"/>
           </w:tcPr>
           <w:p>
             <w:pPr>
@@ -719,7 +1223,231 @@
         </w:tc>
         <w:tc>
           <w:tcPr>
-            <w:tcW w:w="4942" w:type="dxa"/>
+            <w:tcW w:w="5680" w:type="dxa"/>
+          </w:tcPr>
+          <w:p>
+            <w:pPr>
+              <w:pStyle w:val="TableText"/>
+            </w:pPr>
+            <w:r>
+              <w:t xml:space="preserve">Download Pupil's Book (PDF)</w:t>
+            </w:r>
+            <w:r>
+              <w:rPr>
+                <w:sz w:val="18"/>
+              </w:rPr>
+              <w:t xml:space="preserve"> (https://drive.google.com/uc?export=download&amp;id=16q5Qcc5jNowFBg-u04rAAXIEE1IgnouF)</w:t>
+            </w:r>
+            <w:r>
+              <w:t xml:space="preserve"> · </w:t>
+            </w:r>
+            <w:r>
+              <w:t xml:space="preserve">read online</w:t>
+            </w:r>
+            <w:r>
+              <w:rPr>
+                <w:sz w:val="18"/>
+              </w:rPr>
+              <w:t xml:space="preserve"> (https://drive.google.com/file/d/16q5Qcc5jNowFBg-u04rAAXIEE1IgnouF/view)</w:t>
+            </w:r>
+            <w:r>
+              <w:t xml:space="preserve"> · </w:t>
+            </w:r>
+            <w:r>
+              <w:t xml:space="preserve">department copy</w:t>
+            </w:r>
+            <w:r>
+              <w:rPr>
+                <w:sz w:val="18"/>
+              </w:rPr>
+              <w:t xml:space="preserve"> (http://www.edupub.gov.lk/Administrator/English/9/en%20pb%20g-9/english%20pb%20G-9.pdf)</w:t>
+            </w:r>
+          </w:p>
+        </w:tc>
+      </w:tr>
+      <w:tr>
+        <w:trPr>
+          <w:cantSplit/>
+        </w:trPr>
+        <w:tc>
+          <w:tcPr>
+            <w:tcW w:w="769" w:type="dxa"/>
+          </w:tcPr>
+          <w:p>
+            <w:pPr>
+              <w:pStyle w:val="TableText"/>
+            </w:pPr>
+            <w:r>
+              <w:t xml:space="preserve">Grade 9</w:t>
+            </w:r>
+          </w:p>
+        </w:tc>
+        <w:tc>
+          <w:tcPr>
+            <w:tcW w:w="3657" w:type="dxa"/>
+          </w:tcPr>
+          <w:p>
+            <w:pPr>
+              <w:pStyle w:val="TableText"/>
+            </w:pPr>
+            <w:r>
+              <w:t xml:space="preserve">Workbook</w:t>
+            </w:r>
+          </w:p>
+        </w:tc>
+        <w:tc>
+          <w:tcPr>
+            <w:tcW w:w="5680" w:type="dxa"/>
+          </w:tcPr>
+          <w:p>
+            <w:pPr>
+              <w:pStyle w:val="TableText"/>
+            </w:pPr>
+            <w:r>
+              <w:t xml:space="preserve">Workbook (PDF)</w:t>
+            </w:r>
+            <w:r>
+              <w:rPr>
+                <w:sz w:val="18"/>
+              </w:rPr>
+              <w:t xml:space="preserve"> (http://www.edupub.gov.lk/Administrator/English/9/en%20wb%20g-9/en%20wb%20g-9.pdf)</w:t>
+            </w:r>
+          </w:p>
+        </w:tc>
+      </w:tr>
+      <w:tr>
+        <w:trPr>
+          <w:cantSplit/>
+        </w:trPr>
+        <w:tc>
+          <w:tcPr>
+            <w:tcW w:w="769" w:type="dxa"/>
+          </w:tcPr>
+          <w:p>
+            <w:pPr>
+              <w:pStyle w:val="TableText"/>
+            </w:pPr>
+            <w:r>
+              <w:t xml:space="preserve">Grade 10</w:t>
+            </w:r>
+          </w:p>
+        </w:tc>
+        <w:tc>
+          <w:tcPr>
+            <w:tcW w:w="3657" w:type="dxa"/>
+          </w:tcPr>
+          <w:p>
+            <w:pPr>
+              <w:pStyle w:val="TableText"/>
+            </w:pPr>
+            <w:r>
+              <w:t xml:space="preserve">Workbook</w:t>
+            </w:r>
+          </w:p>
+        </w:tc>
+        <w:tc>
+          <w:tcPr>
+            <w:tcW w:w="5680" w:type="dxa"/>
+          </w:tcPr>
+          <w:p>
+            <w:pPr>
+              <w:pStyle w:val="TableText"/>
+            </w:pPr>
+            <w:r>
+              <w:t xml:space="preserve">Workbook (PDF)</w:t>
+            </w:r>
+            <w:r>
+              <w:rPr>
+                <w:sz w:val="18"/>
+              </w:rPr>
+              <w:t xml:space="preserve"> (http://www.edupub.gov.lk/Administrator/English/10/English%20Work%20Book%20G%2010%20E/english%20WB%20G-10.pdf)</w:t>
+            </w:r>
+          </w:p>
+        </w:tc>
+      </w:tr>
+      <w:tr>
+        <w:trPr>
+          <w:cantSplit/>
+        </w:trPr>
+        <w:tc>
+          <w:tcPr>
+            <w:tcW w:w="769" w:type="dxa"/>
+          </w:tcPr>
+          <w:p>
+            <w:pPr>
+              <w:pStyle w:val="TableText"/>
+            </w:pPr>
+            <w:r>
+              <w:t xml:space="preserve">Grade 10</w:t>
+            </w:r>
+          </w:p>
+        </w:tc>
+        <w:tc>
+          <w:tcPr>
+            <w:tcW w:w="3657" w:type="dxa"/>
+          </w:tcPr>
+          <w:p>
+            <w:pPr>
+              <w:pStyle w:val="TableText"/>
+            </w:pPr>
+            <w:r>
+              <w:t xml:space="preserve">Appreciation of English Literary Texts</w:t>
+            </w:r>
+          </w:p>
+        </w:tc>
+        <w:tc>
+          <w:tcPr>
+            <w:tcW w:w="5680" w:type="dxa"/>
+          </w:tcPr>
+          <w:p>
+            <w:pPr>
+              <w:pStyle w:val="TableText"/>
+            </w:pPr>
+            <w:r>
+              <w:t xml:space="preserve">Appreciation of English Literary Texts (PDF)</w:t>
+            </w:r>
+            <w:r>
+              <w:rPr>
+                <w:sz w:val="18"/>
+              </w:rPr>
+              <w:t xml:space="preserve"> (http://www.edupub.gov.lk/Administrator/English/10/en%20ap%20g-10/English%20Literary%20texts.pdf)</w:t>
+            </w:r>
+          </w:p>
+        </w:tc>
+      </w:tr>
+      <w:tr>
+        <w:trPr>
+          <w:cantSplit/>
+        </w:trPr>
+        <w:tc>
+          <w:tcPr>
+            <w:tcW w:w="769" w:type="dxa"/>
+          </w:tcPr>
+          <w:p>
+            <w:pPr>
+              <w:pStyle w:val="TableText"/>
+            </w:pPr>
+            <w:r>
+              <w:t xml:space="preserve">Grade 11</w:t>
+            </w:r>
+          </w:p>
+        </w:tc>
+        <w:tc>
+          <w:tcPr>
+            <w:tcW w:w="3657" w:type="dxa"/>
+          </w:tcPr>
+          <w:p>
+            <w:pPr>
+              <w:pStyle w:val="TableText"/>
+            </w:pPr>
+            <w:r>
+              <w:t xml:space="preserve">Pupil's Book</w:t>
+            </w:r>
+          </w:p>
+        </w:tc>
+        <w:tc>
+          <w:tcPr>
+            <w:tcW w:w="5680" w:type="dxa"/>
           </w:tcPr>
           <w:p>
             <w:pPr>
@@ -732,31 +1460,31 @@
               <w:rPr>
                 <w:sz w:val="18"/>
               </w:rPr>
-              <w:t xml:space="preserve"> (http://www.edupub.gov.lk/Administrator/English/5/english%20pb%20G-5/English%20PB%20G-5.pdf)</w:t>
-            </w:r>
-          </w:p>
-        </w:tc>
-      </w:tr>
-      <w:tr>
-        <w:trPr>
-          <w:cantSplit/>
-        </w:trPr>
-        <w:tc>
-          <w:tcPr>
-            <w:tcW w:w="898" w:type="dxa"/>
-          </w:tcPr>
-          <w:p>
-            <w:pPr>
-              <w:pStyle w:val="TableText"/>
-            </w:pPr>
-            <w:r>
-              <w:t xml:space="preserve">Grade 5</w:t>
-            </w:r>
-          </w:p>
-        </w:tc>
-        <w:tc>
-          <w:tcPr>
-            <w:tcW w:w="4266" w:type="dxa"/>
+              <w:t xml:space="preserve"> (http://www.edupub.gov.lk/Administrator/English/11/english%20PB%20G-11/book.pdf)</w:t>
+            </w:r>
+          </w:p>
+        </w:tc>
+      </w:tr>
+      <w:tr>
+        <w:trPr>
+          <w:cantSplit/>
+        </w:trPr>
+        <w:tc>
+          <w:tcPr>
+            <w:tcW w:w="769" w:type="dxa"/>
+          </w:tcPr>
+          <w:p>
+            <w:pPr>
+              <w:pStyle w:val="TableText"/>
+            </w:pPr>
+            <w:r>
+              <w:t xml:space="preserve">Grade 11</w:t>
+            </w:r>
+          </w:p>
+        </w:tc>
+        <w:tc>
+          <w:tcPr>
+            <w:tcW w:w="3657" w:type="dxa"/>
           </w:tcPr>
           <w:p>
             <w:pPr>
@@ -769,681 +1497,7 @@
         </w:tc>
         <w:tc>
           <w:tcPr>
-            <w:tcW w:w="4942" w:type="dxa"/>
-          </w:tcPr>
-          <w:p>
-            <w:pPr>
-              <w:pStyle w:val="TableText"/>
-            </w:pPr>
-            <w:r>
-              <w:t xml:space="preserve">Workbook (PDF)</w:t>
-            </w:r>
-            <w:r>
-              <w:rPr>
-                <w:sz w:val="18"/>
-              </w:rPr>
-              <w:t xml:space="preserve"> (http://www.edupub.gov.lk/Administrator/English/5/english%20WB%20G-5/english%20G-5%20WB.pdf)</w:t>
-            </w:r>
-          </w:p>
-        </w:tc>
-      </w:tr>
-      <w:tr>
-        <w:trPr>
-          <w:cantSplit/>
-        </w:trPr>
-        <w:tc>
-          <w:tcPr>
-            <w:tcW w:w="898" w:type="dxa"/>
-          </w:tcPr>
-          <w:p>
-            <w:pPr>
-              <w:pStyle w:val="TableText"/>
-            </w:pPr>
-            <w:r>
-              <w:t xml:space="preserve">Grade 5</w:t>
-            </w:r>
-          </w:p>
-        </w:tc>
-        <w:tc>
-          <w:tcPr>
-            <w:tcW w:w="4266" w:type="dxa"/>
-          </w:tcPr>
-          <w:p>
-            <w:pPr>
-              <w:pStyle w:val="TableText"/>
-            </w:pPr>
-            <w:r>
-              <w:t xml:space="preserve">Workbook Part I (earlier edition)</w:t>
-            </w:r>
-          </w:p>
-        </w:tc>
-        <w:tc>
-          <w:tcPr>
-            <w:tcW w:w="4942" w:type="dxa"/>
-          </w:tcPr>
-          <w:p>
-            <w:pPr>
-              <w:pStyle w:val="TableText"/>
-            </w:pPr>
-            <w:r>
-              <w:t xml:space="preserve">Workbook Part I (earlier edition) (PDF)</w:t>
-            </w:r>
-            <w:r>
-              <w:rPr>
-                <w:sz w:val="18"/>
-              </w:rPr>
-              <w:t xml:space="preserve"> (http://www.edupub.gov.lk/Administrator/English/5/english%20wb%20G-5%20P-I/English%20WB%20Gra.-5%20Part-I.pdf)</w:t>
-            </w:r>
-          </w:p>
-        </w:tc>
-      </w:tr>
-      <w:tr>
-        <w:trPr>
-          <w:cantSplit/>
-        </w:trPr>
-        <w:tc>
-          <w:tcPr>
-            <w:tcW w:w="898" w:type="dxa"/>
-          </w:tcPr>
-          <w:p>
-            <w:pPr>
-              <w:pStyle w:val="TableText"/>
-            </w:pPr>
-            <w:r>
-              <w:t xml:space="preserve">Grade 5</w:t>
-            </w:r>
-          </w:p>
-        </w:tc>
-        <w:tc>
-          <w:tcPr>
-            <w:tcW w:w="4266" w:type="dxa"/>
-          </w:tcPr>
-          <w:p>
-            <w:pPr>
-              <w:pStyle w:val="TableText"/>
-            </w:pPr>
-            <w:r>
-              <w:t xml:space="preserve">Workbook Part II (earlier edition)</w:t>
-            </w:r>
-          </w:p>
-        </w:tc>
-        <w:tc>
-          <w:tcPr>
-            <w:tcW w:w="4942" w:type="dxa"/>
-          </w:tcPr>
-          <w:p>
-            <w:pPr>
-              <w:pStyle w:val="TableText"/>
-            </w:pPr>
-            <w:r>
-              <w:t xml:space="preserve">Workbook Part II (earlier edition) (PDF)</w:t>
-            </w:r>
-            <w:r>
-              <w:rPr>
-                <w:sz w:val="18"/>
-              </w:rPr>
-              <w:t xml:space="preserve"> (http://www.edupub.gov.lk/Administrator/English/5/english%20wb%20G-5%20P-II/English%20WB%20Gra.-5%20Part%20-II.pdf)</w:t>
-            </w:r>
-          </w:p>
-        </w:tc>
-      </w:tr>
-      <w:tr>
-        <w:trPr>
-          <w:cantSplit/>
-        </w:trPr>
-        <w:tc>
-          <w:tcPr>
-            <w:tcW w:w="898" w:type="dxa"/>
-          </w:tcPr>
-          <w:p>
-            <w:pPr>
-              <w:pStyle w:val="TableText"/>
-            </w:pPr>
-            <w:r>
-              <w:t xml:space="preserve">Grade 6</w:t>
-            </w:r>
-          </w:p>
-        </w:tc>
-        <w:tc>
-          <w:tcPr>
-            <w:tcW w:w="4266" w:type="dxa"/>
-          </w:tcPr>
-          <w:p>
-            <w:pPr>
-              <w:pStyle w:val="TableText"/>
-            </w:pPr>
-            <w:r>
-              <w:t xml:space="preserve">Pupil's Book</w:t>
-            </w:r>
-          </w:p>
-        </w:tc>
-        <w:tc>
-          <w:tcPr>
-            <w:tcW w:w="4942" w:type="dxa"/>
-          </w:tcPr>
-          <w:p>
-            <w:pPr>
-              <w:pStyle w:val="TableText"/>
-            </w:pPr>
-            <w:r>
-              <w:t xml:space="preserve">Pupil's Book (PDF)</w:t>
-            </w:r>
-            <w:r>
-              <w:rPr>
-                <w:sz w:val="18"/>
-              </w:rPr>
-              <w:t xml:space="preserve"> (https://drive.google.com/file/d/1Ta5sHpYrp23ywq4HugdEG1BrqB8tWCdl/view)</w:t>
-            </w:r>
-            <w:r>
-              <w:t xml:space="preserve"> · </w:t>
-            </w:r>
-            <w:r>
-              <w:t xml:space="preserve">department copy</w:t>
-            </w:r>
-            <w:r>
-              <w:rPr>
-                <w:sz w:val="18"/>
-              </w:rPr>
-              <w:t xml:space="preserve"> (http://www.edupub.gov.lk/Administrator/English/6/english%20PB%20G-6/english%20PB%20G-6.pdf)</w:t>
-            </w:r>
-          </w:p>
-        </w:tc>
-      </w:tr>
-      <w:tr>
-        <w:trPr>
-          <w:cantSplit/>
-        </w:trPr>
-        <w:tc>
-          <w:tcPr>
-            <w:tcW w:w="898" w:type="dxa"/>
-          </w:tcPr>
-          <w:p>
-            <w:pPr>
-              <w:pStyle w:val="TableText"/>
-            </w:pPr>
-            <w:r>
-              <w:t xml:space="preserve">Grade 6</w:t>
-            </w:r>
-          </w:p>
-        </w:tc>
-        <w:tc>
-          <w:tcPr>
-            <w:tcW w:w="4266" w:type="dxa"/>
-          </w:tcPr>
-          <w:p>
-            <w:pPr>
-              <w:pStyle w:val="TableText"/>
-            </w:pPr>
-            <w:r>
-              <w:t xml:space="preserve">Workbook</w:t>
-            </w:r>
-          </w:p>
-        </w:tc>
-        <w:tc>
-          <w:tcPr>
-            <w:tcW w:w="4942" w:type="dxa"/>
-          </w:tcPr>
-          <w:p>
-            <w:pPr>
-              <w:pStyle w:val="TableText"/>
-            </w:pPr>
-            <w:r>
-              <w:t xml:space="preserve">Workbook (PDF)</w:t>
-            </w:r>
-            <w:r>
-              <w:rPr>
-                <w:sz w:val="18"/>
-              </w:rPr>
-              <w:t xml:space="preserve"> (http://www.edupub.gov.lk/Administrator/English/6/english%20wb%20G-6/A94779_ENGLISH%20WORKBOOK%20-%20GRADE%2006.pdf)</w:t>
-            </w:r>
-          </w:p>
-        </w:tc>
-      </w:tr>
-      <w:tr>
-        <w:trPr>
-          <w:cantSplit/>
-        </w:trPr>
-        <w:tc>
-          <w:tcPr>
-            <w:tcW w:w="898" w:type="dxa"/>
-          </w:tcPr>
-          <w:p>
-            <w:pPr>
-              <w:pStyle w:val="TableText"/>
-            </w:pPr>
-            <w:r>
-              <w:t xml:space="preserve">Grade 7</w:t>
-            </w:r>
-          </w:p>
-        </w:tc>
-        <w:tc>
-          <w:tcPr>
-            <w:tcW w:w="4266" w:type="dxa"/>
-          </w:tcPr>
-          <w:p>
-            <w:pPr>
-              <w:pStyle w:val="TableText"/>
-            </w:pPr>
-            <w:r>
-              <w:t xml:space="preserve">Workbook</w:t>
-            </w:r>
-          </w:p>
-        </w:tc>
-        <w:tc>
-          <w:tcPr>
-            <w:tcW w:w="4942" w:type="dxa"/>
-          </w:tcPr>
-          <w:p>
-            <w:pPr>
-              <w:pStyle w:val="TableText"/>
-            </w:pPr>
-            <w:r>
-              <w:t xml:space="preserve">Workbook (PDF)</w:t>
-            </w:r>
-            <w:r>
-              <w:rPr>
-                <w:sz w:val="18"/>
-              </w:rPr>
-              <w:t xml:space="preserve"> (http://www.edupub.gov.lk/Administrator/English/7/en%20wb%20g-7/en%20WB%20G-7.pdf)</w:t>
-            </w:r>
-          </w:p>
-        </w:tc>
-      </w:tr>
-      <w:tr>
-        <w:trPr>
-          <w:cantSplit/>
-        </w:trPr>
-        <w:tc>
-          <w:tcPr>
-            <w:tcW w:w="898" w:type="dxa"/>
-          </w:tcPr>
-          <w:p>
-            <w:pPr>
-              <w:pStyle w:val="TableText"/>
-            </w:pPr>
-            <w:r>
-              <w:t xml:space="preserve">Grade 8</w:t>
-            </w:r>
-          </w:p>
-        </w:tc>
-        <w:tc>
-          <w:tcPr>
-            <w:tcW w:w="4266" w:type="dxa"/>
-          </w:tcPr>
-          <w:p>
-            <w:pPr>
-              <w:pStyle w:val="TableText"/>
-            </w:pPr>
-            <w:r>
-              <w:t xml:space="preserve">Pupil's Book</w:t>
-            </w:r>
-          </w:p>
-        </w:tc>
-        <w:tc>
-          <w:tcPr>
-            <w:tcW w:w="4942" w:type="dxa"/>
-          </w:tcPr>
-          <w:p>
-            <w:pPr>
-              <w:pStyle w:val="TableText"/>
-            </w:pPr>
-            <w:r>
-              <w:t xml:space="preserve">Pupil's Book (PDF)</w:t>
-            </w:r>
-            <w:r>
-              <w:rPr>
-                <w:sz w:val="18"/>
-              </w:rPr>
-              <w:t xml:space="preserve"> (http://www.edupub.gov.lk/Administrator/English/8/en%20pb%20g-8/en%20PB%20g-8.pdf)</w:t>
-            </w:r>
-          </w:p>
-        </w:tc>
-      </w:tr>
-      <w:tr>
-        <w:trPr>
-          <w:cantSplit/>
-        </w:trPr>
-        <w:tc>
-          <w:tcPr>
-            <w:tcW w:w="898" w:type="dxa"/>
-          </w:tcPr>
-          <w:p>
-            <w:pPr>
-              <w:pStyle w:val="TableText"/>
-            </w:pPr>
-            <w:r>
-              <w:t xml:space="preserve">Grade 8</w:t>
-            </w:r>
-          </w:p>
-        </w:tc>
-        <w:tc>
-          <w:tcPr>
-            <w:tcW w:w="4266" w:type="dxa"/>
-          </w:tcPr>
-          <w:p>
-            <w:pPr>
-              <w:pStyle w:val="TableText"/>
-            </w:pPr>
-            <w:r>
-              <w:t xml:space="preserve">Workbook</w:t>
-            </w:r>
-          </w:p>
-        </w:tc>
-        <w:tc>
-          <w:tcPr>
-            <w:tcW w:w="4942" w:type="dxa"/>
-          </w:tcPr>
-          <w:p>
-            <w:pPr>
-              <w:pStyle w:val="TableText"/>
-            </w:pPr>
-            <w:r>
-              <w:t xml:space="preserve">Workbook (PDF)</w:t>
-            </w:r>
-            <w:r>
-              <w:rPr>
-                <w:sz w:val="18"/>
-              </w:rPr>
-              <w:t xml:space="preserve"> (http://www.edupub.gov.lk/Administrator/English/8/en%20wb%20g-8/english%20WB%20g-8.pdf)</w:t>
-            </w:r>
-          </w:p>
-        </w:tc>
-      </w:tr>
-      <w:tr>
-        <w:trPr>
-          <w:cantSplit/>
-        </w:trPr>
-        <w:tc>
-          <w:tcPr>
-            <w:tcW w:w="898" w:type="dxa"/>
-          </w:tcPr>
-          <w:p>
-            <w:pPr>
-              <w:pStyle w:val="TableText"/>
-            </w:pPr>
-            <w:r>
-              <w:t xml:space="preserve">Grade 9</w:t>
-            </w:r>
-          </w:p>
-        </w:tc>
-        <w:tc>
-          <w:tcPr>
-            <w:tcW w:w="4266" w:type="dxa"/>
-          </w:tcPr>
-          <w:p>
-            <w:pPr>
-              <w:pStyle w:val="TableText"/>
-            </w:pPr>
-            <w:r>
-              <w:t xml:space="preserve">Pupil's Book</w:t>
-            </w:r>
-          </w:p>
-        </w:tc>
-        <w:tc>
-          <w:tcPr>
-            <w:tcW w:w="4942" w:type="dxa"/>
-          </w:tcPr>
-          <w:p>
-            <w:pPr>
-              <w:pStyle w:val="TableText"/>
-            </w:pPr>
-            <w:r>
-              <w:t xml:space="preserve">Pupil's Book (PDF)</w:t>
-            </w:r>
-            <w:r>
-              <w:rPr>
-                <w:sz w:val="18"/>
-              </w:rPr>
-              <w:t xml:space="preserve"> (https://drive.google.com/file/d/16q5Qcc5jNowFBg-u04rAAXIEE1IgnouF/view)</w:t>
-            </w:r>
-            <w:r>
-              <w:t xml:space="preserve"> · </w:t>
-            </w:r>
-            <w:r>
-              <w:t xml:space="preserve">department copy</w:t>
-            </w:r>
-            <w:r>
-              <w:rPr>
-                <w:sz w:val="18"/>
-              </w:rPr>
-              <w:t xml:space="preserve"> (http://www.edupub.gov.lk/Administrator/English/9/en%20pb%20g-9/english%20pb%20G-9.pdf)</w:t>
-            </w:r>
-          </w:p>
-        </w:tc>
-      </w:tr>
-      <w:tr>
-        <w:trPr>
-          <w:cantSplit/>
-        </w:trPr>
-        <w:tc>
-          <w:tcPr>
-            <w:tcW w:w="898" w:type="dxa"/>
-          </w:tcPr>
-          <w:p>
-            <w:pPr>
-              <w:pStyle w:val="TableText"/>
-            </w:pPr>
-            <w:r>
-              <w:t xml:space="preserve">Grade 9</w:t>
-            </w:r>
-          </w:p>
-        </w:tc>
-        <w:tc>
-          <w:tcPr>
-            <w:tcW w:w="4266" w:type="dxa"/>
-          </w:tcPr>
-          <w:p>
-            <w:pPr>
-              <w:pStyle w:val="TableText"/>
-            </w:pPr>
-            <w:r>
-              <w:t xml:space="preserve">Workbook</w:t>
-            </w:r>
-          </w:p>
-        </w:tc>
-        <w:tc>
-          <w:tcPr>
-            <w:tcW w:w="4942" w:type="dxa"/>
-          </w:tcPr>
-          <w:p>
-            <w:pPr>
-              <w:pStyle w:val="TableText"/>
-            </w:pPr>
-            <w:r>
-              <w:t xml:space="preserve">Workbook (PDF)</w:t>
-            </w:r>
-            <w:r>
-              <w:rPr>
-                <w:sz w:val="18"/>
-              </w:rPr>
-              <w:t xml:space="preserve"> (http://www.edupub.gov.lk/Administrator/English/9/en%20wb%20g-9/en%20wb%20g-9.pdf)</w:t>
-            </w:r>
-          </w:p>
-        </w:tc>
-      </w:tr>
-      <w:tr>
-        <w:trPr>
-          <w:cantSplit/>
-        </w:trPr>
-        <w:tc>
-          <w:tcPr>
-            <w:tcW w:w="898" w:type="dxa"/>
-          </w:tcPr>
-          <w:p>
-            <w:pPr>
-              <w:pStyle w:val="TableText"/>
-            </w:pPr>
-            <w:r>
-              <w:t xml:space="preserve">Grade 10</w:t>
-            </w:r>
-          </w:p>
-        </w:tc>
-        <w:tc>
-          <w:tcPr>
-            <w:tcW w:w="4266" w:type="dxa"/>
-          </w:tcPr>
-          <w:p>
-            <w:pPr>
-              <w:pStyle w:val="TableText"/>
-            </w:pPr>
-            <w:r>
-              <w:t xml:space="preserve">Workbook</w:t>
-            </w:r>
-          </w:p>
-        </w:tc>
-        <w:tc>
-          <w:tcPr>
-            <w:tcW w:w="4942" w:type="dxa"/>
-          </w:tcPr>
-          <w:p>
-            <w:pPr>
-              <w:pStyle w:val="TableText"/>
-            </w:pPr>
-            <w:r>
-              <w:t xml:space="preserve">Workbook (PDF)</w:t>
-            </w:r>
-            <w:r>
-              <w:rPr>
-                <w:sz w:val="18"/>
-              </w:rPr>
-              <w:t xml:space="preserve"> (http://www.edupub.gov.lk/Administrator/English/10/English%20Work%20Book%20G%2010%20E/english%20WB%20G-10.pdf)</w:t>
-            </w:r>
-          </w:p>
-        </w:tc>
-      </w:tr>
-      <w:tr>
-        <w:trPr>
-          <w:cantSplit/>
-        </w:trPr>
-        <w:tc>
-          <w:tcPr>
-            <w:tcW w:w="898" w:type="dxa"/>
-          </w:tcPr>
-          <w:p>
-            <w:pPr>
-              <w:pStyle w:val="TableText"/>
-            </w:pPr>
-            <w:r>
-              <w:t xml:space="preserve">Grade 10</w:t>
-            </w:r>
-          </w:p>
-        </w:tc>
-        <w:tc>
-          <w:tcPr>
-            <w:tcW w:w="4266" w:type="dxa"/>
-          </w:tcPr>
-          <w:p>
-            <w:pPr>
-              <w:pStyle w:val="TableText"/>
-            </w:pPr>
-            <w:r>
-              <w:t xml:space="preserve">Appreciation of English Literary Texts</w:t>
-            </w:r>
-          </w:p>
-        </w:tc>
-        <w:tc>
-          <w:tcPr>
-            <w:tcW w:w="4942" w:type="dxa"/>
-          </w:tcPr>
-          <w:p>
-            <w:pPr>
-              <w:pStyle w:val="TableText"/>
-            </w:pPr>
-            <w:r>
-              <w:t xml:space="preserve">Appreciation of English Literary Texts (PDF)</w:t>
-            </w:r>
-            <w:r>
-              <w:rPr>
-                <w:sz w:val="18"/>
-              </w:rPr>
-              <w:t xml:space="preserve"> (http://www.edupub.gov.lk/Administrator/English/10/en%20ap%20g-10/English%20Literary%20texts.pdf)</w:t>
-            </w:r>
-          </w:p>
-        </w:tc>
-      </w:tr>
-      <w:tr>
-        <w:trPr>
-          <w:cantSplit/>
-        </w:trPr>
-        <w:tc>
-          <w:tcPr>
-            <w:tcW w:w="898" w:type="dxa"/>
-          </w:tcPr>
-          <w:p>
-            <w:pPr>
-              <w:pStyle w:val="TableText"/>
-            </w:pPr>
-            <w:r>
-              <w:t xml:space="preserve">Grade 11</w:t>
-            </w:r>
-          </w:p>
-        </w:tc>
-        <w:tc>
-          <w:tcPr>
-            <w:tcW w:w="4266" w:type="dxa"/>
-          </w:tcPr>
-          <w:p>
-            <w:pPr>
-              <w:pStyle w:val="TableText"/>
-            </w:pPr>
-            <w:r>
-              <w:t xml:space="preserve">Pupil's Book</w:t>
-            </w:r>
-          </w:p>
-        </w:tc>
-        <w:tc>
-          <w:tcPr>
-            <w:tcW w:w="4942" w:type="dxa"/>
-          </w:tcPr>
-          <w:p>
-            <w:pPr>
-              <w:pStyle w:val="TableText"/>
-            </w:pPr>
-            <w:r>
-              <w:t xml:space="preserve">Pupil's Book (PDF)</w:t>
-            </w:r>
-            <w:r>
-              <w:rPr>
-                <w:sz w:val="18"/>
-              </w:rPr>
-              <w:t xml:space="preserve"> (http://www.edupub.gov.lk/Administrator/English/11/english%20PB%20G-11/book.pdf)</w:t>
-            </w:r>
-          </w:p>
-        </w:tc>
-      </w:tr>
-      <w:tr>
-        <w:trPr>
-          <w:cantSplit/>
-        </w:trPr>
-        <w:tc>
-          <w:tcPr>
-            <w:tcW w:w="898" w:type="dxa"/>
-          </w:tcPr>
-          <w:p>
-            <w:pPr>
-              <w:pStyle w:val="TableText"/>
-            </w:pPr>
-            <w:r>
-              <w:t xml:space="preserve">Grade 11</w:t>
-            </w:r>
-          </w:p>
-        </w:tc>
-        <w:tc>
-          <w:tcPr>
-            <w:tcW w:w="4266" w:type="dxa"/>
-          </w:tcPr>
-          <w:p>
-            <w:pPr>
-              <w:pStyle w:val="TableText"/>
-            </w:pPr>
-            <w:r>
-              <w:t xml:space="preserve">Workbook</w:t>
-            </w:r>
-          </w:p>
-        </w:tc>
-        <w:tc>
-          <w:tcPr>
-            <w:tcW w:w="4942" w:type="dxa"/>
+            <w:tcW w:w="5680" w:type="dxa"/>
           </w:tcPr>
           <w:p>
             <w:pPr>
@@ -2546,9 +2600,9 @@
         </w:tblCellMar>
       </w:tblPr>
       <w:tblGrid>
-        <w:gridCol w:w="1443"/>
-        <w:gridCol w:w="4060"/>
-        <w:gridCol w:w="4603"/>
+        <w:gridCol w:w="1336"/>
+        <w:gridCol w:w="3758"/>
+        <w:gridCol w:w="5012"/>
       </w:tblGrid>
       <w:tr>
         <w:trPr>
@@ -2557,7 +2611,7 @@
         </w:trPr>
         <w:tc>
           <w:tcPr>
-            <w:tcW w:w="1443" w:type="dxa"/>
+            <w:tcW w:w="1336" w:type="dxa"/>
             <w:shd w:val="clear" w:color="auto" w:fill="DCE6F2"/>
           </w:tcPr>
           <w:p>
@@ -2574,7 +2628,7 @@
         </w:tc>
         <w:tc>
           <w:tcPr>
-            <w:tcW w:w="4060" w:type="dxa"/>
+            <w:tcW w:w="3758" w:type="dxa"/>
             <w:shd w:val="clear" w:color="auto" w:fill="DCE6F2"/>
           </w:tcPr>
           <w:p>
@@ -2591,7 +2645,7 @@
         </w:tc>
         <w:tc>
           <w:tcPr>
-            <w:tcW w:w="4603" w:type="dxa"/>
+            <w:tcW w:w="5012" w:type="dxa"/>
             <w:shd w:val="clear" w:color="auto" w:fill="DCE6F2"/>
           </w:tcPr>
           <w:p>
@@ -2613,7 +2667,7 @@
         </w:trPr>
         <w:tc>
           <w:tcPr>
-            <w:tcW w:w="1443" w:type="dxa"/>
+            <w:tcW w:w="1336" w:type="dxa"/>
           </w:tcPr>
           <w:p>
             <w:pPr>
@@ -2626,7 +2680,7 @@
         </w:tc>
         <w:tc>
           <w:tcPr>
-            <w:tcW w:w="4060" w:type="dxa"/>
+            <w:tcW w:w="3758" w:type="dxa"/>
           </w:tcPr>
           <w:p>
             <w:pPr>
@@ -2639,7 +2693,7 @@
         </w:tc>
         <w:tc>
           <w:tcPr>
-            <w:tcW w:w="4603" w:type="dxa"/>
+            <w:tcW w:w="5012" w:type="dxa"/>
           </w:tcPr>
           <w:p>
             <w:pPr>
@@ -2663,7 +2717,7 @@
         </w:trPr>
         <w:tc>
           <w:tcPr>
-            <w:tcW w:w="1443" w:type="dxa"/>
+            <w:tcW w:w="1336" w:type="dxa"/>
           </w:tcPr>
           <w:p>
             <w:pPr>
@@ -2676,7 +2730,7 @@
         </w:tc>
         <w:tc>
           <w:tcPr>
-            <w:tcW w:w="4060" w:type="dxa"/>
+            <w:tcW w:w="3758" w:type="dxa"/>
           </w:tcPr>
           <w:p>
             <w:pPr>
@@ -2689,7 +2743,7 @@
         </w:tc>
         <w:tc>
           <w:tcPr>
-            <w:tcW w:w="4603" w:type="dxa"/>
+            <w:tcW w:w="5012" w:type="dxa"/>
           </w:tcPr>
           <w:p>
             <w:pPr>
@@ -2713,7 +2767,7 @@
         </w:trPr>
         <w:tc>
           <w:tcPr>
-            <w:tcW w:w="1443" w:type="dxa"/>
+            <w:tcW w:w="1336" w:type="dxa"/>
           </w:tcPr>
           <w:p>
             <w:pPr>
@@ -2726,7 +2780,7 @@
         </w:tc>
         <w:tc>
           <w:tcPr>
-            <w:tcW w:w="4060" w:type="dxa"/>
+            <w:tcW w:w="3758" w:type="dxa"/>
           </w:tcPr>
           <w:p>
             <w:pPr>
@@ -2739,7 +2793,7 @@
         </w:tc>
         <w:tc>
           <w:tcPr>
-            <w:tcW w:w="4603" w:type="dxa"/>
+            <w:tcW w:w="5012" w:type="dxa"/>
           </w:tcPr>
           <w:p>
             <w:pPr>
@@ -2763,7 +2817,7 @@
         </w:trPr>
         <w:tc>
           <w:tcPr>
-            <w:tcW w:w="1443" w:type="dxa"/>
+            <w:tcW w:w="1336" w:type="dxa"/>
           </w:tcPr>
           <w:p>
             <w:pPr>
@@ -2776,7 +2830,7 @@
         </w:tc>
         <w:tc>
           <w:tcPr>
-            <w:tcW w:w="4060" w:type="dxa"/>
+            <w:tcW w:w="3758" w:type="dxa"/>
           </w:tcPr>
           <w:p>
             <w:pPr>
@@ -2789,14 +2843,26 @@
         </w:tc>
         <w:tc>
           <w:tcPr>
-            <w:tcW w:w="4603" w:type="dxa"/>
-          </w:tcPr>
-          <w:p>
-            <w:pPr>
-              <w:pStyle w:val="TableText"/>
-            </w:pPr>
-            <w:r>
-              <w:t xml:space="preserve">English (2018) (PDF)</w:t>
+            <w:tcW w:w="5012" w:type="dxa"/>
+          </w:tcPr>
+          <w:p>
+            <w:pPr>
+              <w:pStyle w:val="TableText"/>
+            </w:pPr>
+            <w:r>
+              <w:t xml:space="preserve">Download English (2018) (PDF)</w:t>
+            </w:r>
+            <w:r>
+              <w:rPr>
+                <w:sz w:val="18"/>
+              </w:rPr>
+              <w:t xml:space="preserve"> (https://drive.google.com/uc?export=download&amp;id=1tXItWDWlgtezo1J7bPx3uIx7m_RIDiCd)</w:t>
+            </w:r>
+            <w:r>
+              <w:t xml:space="preserve"> · </w:t>
+            </w:r>
+            <w:r>
+              <w:t xml:space="preserve">read online</w:t>
             </w:r>
             <w:r>
               <w:rPr>
@@ -2825,7 +2891,7 @@
         </w:trPr>
         <w:tc>
           <w:tcPr>
-            <w:tcW w:w="1443" w:type="dxa"/>
+            <w:tcW w:w="1336" w:type="dxa"/>
           </w:tcPr>
           <w:p>
             <w:pPr>
@@ -2838,7 +2904,7 @@
         </w:tc>
         <w:tc>
           <w:tcPr>
-            <w:tcW w:w="4060" w:type="dxa"/>
+            <w:tcW w:w="3758" w:type="dxa"/>
           </w:tcPr>
           <w:p>
             <w:pPr>
@@ -2851,14 +2917,26 @@
         </w:tc>
         <w:tc>
           <w:tcPr>
-            <w:tcW w:w="4603" w:type="dxa"/>
-          </w:tcPr>
-          <w:p>
-            <w:pPr>
-              <w:pStyle w:val="TableText"/>
-            </w:pPr>
-            <w:r>
-              <w:t xml:space="preserve">English (2020) (PDF)</w:t>
+            <w:tcW w:w="5012" w:type="dxa"/>
+          </w:tcPr>
+          <w:p>
+            <w:pPr>
+              <w:pStyle w:val="TableText"/>
+            </w:pPr>
+            <w:r>
+              <w:t xml:space="preserve">Download English (2020) (PDF)</w:t>
+            </w:r>
+            <w:r>
+              <w:rPr>
+                <w:sz w:val="18"/>
+              </w:rPr>
+              <w:t xml:space="preserve"> (https://drive.google.com/uc?export=download&amp;id=17C5Uf0i3mmePWXx2h1UpW0KaPAH7935R)</w:t>
+            </w:r>
+            <w:r>
+              <w:t xml:space="preserve"> · </w:t>
+            </w:r>
+            <w:r>
+              <w:t xml:space="preserve">read online</w:t>
             </w:r>
             <w:r>
               <w:rPr>
@@ -2887,7 +2965,7 @@
         </w:trPr>
         <w:tc>
           <w:tcPr>
-            <w:tcW w:w="1443" w:type="dxa"/>
+            <w:tcW w:w="1336" w:type="dxa"/>
           </w:tcPr>
           <w:p>
             <w:pPr>
@@ -2900,7 +2978,7 @@
         </w:tc>
         <w:tc>
           <w:tcPr>
-            <w:tcW w:w="4060" w:type="dxa"/>
+            <w:tcW w:w="3758" w:type="dxa"/>
           </w:tcPr>
           <w:p>
             <w:pPr>
@@ -2913,14 +2991,26 @@
         </w:tc>
         <w:tc>
           <w:tcPr>
-            <w:tcW w:w="4603" w:type="dxa"/>
-          </w:tcPr>
-          <w:p>
-            <w:pPr>
-              <w:pStyle w:val="TableText"/>
-            </w:pPr>
-            <w:r>
-              <w:t xml:space="preserve">English (2015) (PDF)</w:t>
+            <w:tcW w:w="5012" w:type="dxa"/>
+          </w:tcPr>
+          <w:p>
+            <w:pPr>
+              <w:pStyle w:val="TableText"/>
+            </w:pPr>
+            <w:r>
+              <w:t xml:space="preserve">Download English (2015) (PDF)</w:t>
+            </w:r>
+            <w:r>
+              <w:rPr>
+                <w:sz w:val="18"/>
+              </w:rPr>
+              <w:t xml:space="preserve"> (https://drive.google.com/uc?export=download&amp;id=1Spyt3mr2rXvh4-HwhjGEoAcx-u2r1FNi)</w:t>
+            </w:r>
+            <w:r>
+              <w:t xml:space="preserve"> · </w:t>
+            </w:r>
+            <w:r>
+              <w:t xml:space="preserve">read online</w:t>
             </w:r>
             <w:r>
               <w:rPr>
@@ -2949,7 +3039,7 @@
         </w:trPr>
         <w:tc>
           <w:tcPr>
-            <w:tcW w:w="1443" w:type="dxa"/>
+            <w:tcW w:w="1336" w:type="dxa"/>
           </w:tcPr>
           <w:p>
             <w:pPr>
@@ -2962,7 +3052,7 @@
         </w:tc>
         <w:tc>
           <w:tcPr>
-            <w:tcW w:w="4060" w:type="dxa"/>
+            <w:tcW w:w="3758" w:type="dxa"/>
           </w:tcPr>
           <w:p>
             <w:pPr>
@@ -2975,14 +3065,26 @@
         </w:tc>
         <w:tc>
           <w:tcPr>
-            <w:tcW w:w="4603" w:type="dxa"/>
-          </w:tcPr>
-          <w:p>
-            <w:pPr>
-              <w:pStyle w:val="TableText"/>
-            </w:pPr>
-            <w:r>
-              <w:t xml:space="preserve">English (2016) (PDF)</w:t>
+            <w:tcW w:w="5012" w:type="dxa"/>
+          </w:tcPr>
+          <w:p>
+            <w:pPr>
+              <w:pStyle w:val="TableText"/>
+            </w:pPr>
+            <w:r>
+              <w:t xml:space="preserve">Download English (2016) (PDF)</w:t>
+            </w:r>
+            <w:r>
+              <w:rPr>
+                <w:sz w:val="18"/>
+              </w:rPr>
+              <w:t xml:space="preserve"> (https://drive.google.com/uc?export=download&amp;id=1Mb4MlXQi6xdv3_Rg68PkzQ92MT4T4DCj)</w:t>
+            </w:r>
+            <w:r>
+              <w:t xml:space="preserve"> · </w:t>
+            </w:r>
+            <w:r>
+              <w:t xml:space="preserve">read online</w:t>
             </w:r>
             <w:r>
               <w:rPr>
@@ -3011,7 +3113,7 @@
         </w:trPr>
         <w:tc>
           <w:tcPr>
-            <w:tcW w:w="1443" w:type="dxa"/>
+            <w:tcW w:w="1336" w:type="dxa"/>
           </w:tcPr>
           <w:p>
             <w:pPr>
@@ -3024,7 +3126,7 @@
         </w:tc>
         <w:tc>
           <w:tcPr>
-            <w:tcW w:w="4060" w:type="dxa"/>
+            <w:tcW w:w="3758" w:type="dxa"/>
           </w:tcPr>
           <w:p>
             <w:pPr>
@@ -3037,7 +3139,7 @@
         </w:tc>
         <w:tc>
           <w:tcPr>
-            <w:tcW w:w="4603" w:type="dxa"/>
+            <w:tcW w:w="5012" w:type="dxa"/>
           </w:tcPr>
           <w:p>
             <w:pPr>
@@ -3061,7 +3163,7 @@
         </w:trPr>
         <w:tc>
           <w:tcPr>
-            <w:tcW w:w="1443" w:type="dxa"/>
+            <w:tcW w:w="1336" w:type="dxa"/>
           </w:tcPr>
           <w:p>
             <w:pPr>
@@ -3074,7 +3176,7 @@
         </w:tc>
         <w:tc>
           <w:tcPr>
-            <w:tcW w:w="4060" w:type="dxa"/>
+            <w:tcW w:w="3758" w:type="dxa"/>
           </w:tcPr>
           <w:p>
             <w:pPr>
@@ -3087,7 +3189,7 @@
         </w:tc>
         <w:tc>
           <w:tcPr>
-            <w:tcW w:w="4603" w:type="dxa"/>
+            <w:tcW w:w="5012" w:type="dxa"/>
           </w:tcPr>
           <w:p>
             <w:pPr>
@@ -3111,7 +3213,7 @@
         </w:trPr>
         <w:tc>
           <w:tcPr>
-            <w:tcW w:w="1443" w:type="dxa"/>
+            <w:tcW w:w="1336" w:type="dxa"/>
           </w:tcPr>
           <w:p>
             <w:pPr>
@@ -3124,7 +3226,7 @@
         </w:tc>
         <w:tc>
           <w:tcPr>
-            <w:tcW w:w="4060" w:type="dxa"/>
+            <w:tcW w:w="3758" w:type="dxa"/>
           </w:tcPr>
           <w:p>
             <w:pPr>
@@ -3137,14 +3239,26 @@
         </w:tc>
         <w:tc>
           <w:tcPr>
-            <w:tcW w:w="4603" w:type="dxa"/>
-          </w:tcPr>
-          <w:p>
-            <w:pPr>
-              <w:pStyle w:val="TableText"/>
-            </w:pPr>
-            <w:r>
-              <w:t xml:space="preserve">English Language (2018) (PDF)</w:t>
+            <w:tcW w:w="5012" w:type="dxa"/>
+          </w:tcPr>
+          <w:p>
+            <w:pPr>
+              <w:pStyle w:val="TableText"/>
+            </w:pPr>
+            <w:r>
+              <w:t xml:space="preserve">Download English Language (2018) (PDF)</w:t>
+            </w:r>
+            <w:r>
+              <w:rPr>
+                <w:sz w:val="18"/>
+              </w:rPr>
+              <w:t xml:space="preserve"> (https://drive.google.com/uc?export=download&amp;id=1V1sOydQCHmoJO-DfVEFn76-0kY6CbS8x)</w:t>
+            </w:r>
+            <w:r>
+              <w:t xml:space="preserve"> · </w:t>
+            </w:r>
+            <w:r>
+              <w:t xml:space="preserve">read online</w:t>
             </w:r>
             <w:r>
               <w:rPr>
@@ -3173,7 +3287,7 @@
         </w:trPr>
         <w:tc>
           <w:tcPr>
-            <w:tcW w:w="1443" w:type="dxa"/>
+            <w:tcW w:w="1336" w:type="dxa"/>
           </w:tcPr>
           <w:p>
             <w:pPr>
@@ -3186,7 +3300,7 @@
         </w:tc>
         <w:tc>
           <w:tcPr>
-            <w:tcW w:w="4060" w:type="dxa"/>
+            <w:tcW w:w="3758" w:type="dxa"/>
           </w:tcPr>
           <w:p>
             <w:pPr>
@@ -3199,7 +3313,7 @@
         </w:tc>
         <w:tc>
           <w:tcPr>
-            <w:tcW w:w="4603" w:type="dxa"/>
+            <w:tcW w:w="5012" w:type="dxa"/>
           </w:tcPr>
           <w:p>
             <w:pPr>
@@ -3223,7 +3337,7 @@
         </w:trPr>
         <w:tc>
           <w:tcPr>
-            <w:tcW w:w="1443" w:type="dxa"/>
+            <w:tcW w:w="1336" w:type="dxa"/>
           </w:tcPr>
           <w:p>
             <w:pPr>
@@ -3236,7 +3350,7 @@
         </w:tc>
         <w:tc>
           <w:tcPr>
-            <w:tcW w:w="4060" w:type="dxa"/>
+            <w:tcW w:w="3758" w:type="dxa"/>
           </w:tcPr>
           <w:p>
             <w:pPr>
@@ -3249,14 +3363,26 @@
         </w:tc>
         <w:tc>
           <w:tcPr>
-            <w:tcW w:w="4603" w:type="dxa"/>
-          </w:tcPr>
-          <w:p>
-            <w:pPr>
-              <w:pStyle w:val="TableText"/>
-            </w:pPr>
-            <w:r>
-              <w:t xml:space="preserve">English (2015) (PDF)</w:t>
+            <w:tcW w:w="5012" w:type="dxa"/>
+          </w:tcPr>
+          <w:p>
+            <w:pPr>
+              <w:pStyle w:val="TableText"/>
+            </w:pPr>
+            <w:r>
+              <w:t xml:space="preserve">Download English (2015) (PDF)</w:t>
+            </w:r>
+            <w:r>
+              <w:rPr>
+                <w:sz w:val="18"/>
+              </w:rPr>
+              <w:t xml:space="preserve"> (https://drive.google.com/uc?export=download&amp;id=1miKnI4IFffmvJy0z22r-wu9fJOzoQXcA)</w:t>
+            </w:r>
+            <w:r>
+              <w:t xml:space="preserve"> · </w:t>
+            </w:r>
+            <w:r>
+              <w:t xml:space="preserve">read online</w:t>
             </w:r>
             <w:r>
               <w:rPr>
@@ -3285,7 +3411,7 @@
         </w:trPr>
         <w:tc>
           <w:tcPr>
-            <w:tcW w:w="1443" w:type="dxa"/>
+            <w:tcW w:w="1336" w:type="dxa"/>
           </w:tcPr>
           <w:p>
             <w:pPr>
@@ -3298,7 +3424,7 @@
         </w:tc>
         <w:tc>
           <w:tcPr>
-            <w:tcW w:w="4060" w:type="dxa"/>
+            <w:tcW w:w="3758" w:type="dxa"/>
           </w:tcPr>
           <w:p>
             <w:pPr>
@@ -3311,7 +3437,7 @@
         </w:tc>
         <w:tc>
           <w:tcPr>
-            <w:tcW w:w="4603" w:type="dxa"/>
+            <w:tcW w:w="5012" w:type="dxa"/>
           </w:tcPr>
           <w:p>
             <w:pPr>
@@ -3335,7 +3461,7 @@
         </w:trPr>
         <w:tc>
           <w:tcPr>
-            <w:tcW w:w="1443" w:type="dxa"/>
+            <w:tcW w:w="1336" w:type="dxa"/>
           </w:tcPr>
           <w:p>
             <w:pPr>
@@ -3348,7 +3474,7 @@
         </w:tc>
         <w:tc>
           <w:tcPr>
-            <w:tcW w:w="4060" w:type="dxa"/>
+            <w:tcW w:w="3758" w:type="dxa"/>
           </w:tcPr>
           <w:p>
             <w:pPr>
@@ -3361,14 +3487,26 @@
         </w:tc>
         <w:tc>
           <w:tcPr>
-            <w:tcW w:w="4603" w:type="dxa"/>
-          </w:tcPr>
-          <w:p>
-            <w:pPr>
-              <w:pStyle w:val="TableText"/>
-            </w:pPr>
-            <w:r>
-              <w:t xml:space="preserve">English Language (2016) (PDF)</w:t>
+            <w:tcW w:w="5012" w:type="dxa"/>
+          </w:tcPr>
+          <w:p>
+            <w:pPr>
+              <w:pStyle w:val="TableText"/>
+            </w:pPr>
+            <w:r>
+              <w:t xml:space="preserve">Download English Language (2016) (PDF)</w:t>
+            </w:r>
+            <w:r>
+              <w:rPr>
+                <w:sz w:val="18"/>
+              </w:rPr>
+              <w:t xml:space="preserve"> (https://drive.google.com/uc?export=download&amp;id=1aFF9iR4m8ls6BprYXKM6yCZ17VUfhRuX)</w:t>
+            </w:r>
+            <w:r>
+              <w:t xml:space="preserve"> · </w:t>
+            </w:r>
+            <w:r>
+              <w:t xml:space="preserve">read online</w:t>
             </w:r>
             <w:r>
               <w:rPr>
@@ -3397,7 +3535,7 @@
         </w:trPr>
         <w:tc>
           <w:tcPr>
-            <w:tcW w:w="1443" w:type="dxa"/>
+            <w:tcW w:w="1336" w:type="dxa"/>
           </w:tcPr>
           <w:p>
             <w:pPr>
@@ -3410,7 +3548,7 @@
         </w:tc>
         <w:tc>
           <w:tcPr>
-            <w:tcW w:w="4060" w:type="dxa"/>
+            <w:tcW w:w="3758" w:type="dxa"/>
           </w:tcPr>
           <w:p>
             <w:pPr>
@@ -3423,14 +3561,26 @@
         </w:tc>
         <w:tc>
           <w:tcPr>
-            <w:tcW w:w="4603" w:type="dxa"/>
-          </w:tcPr>
-          <w:p>
-            <w:pPr>
-              <w:pStyle w:val="TableText"/>
-            </w:pPr>
-            <w:r>
-              <w:t xml:space="preserve">General English (2017) (PDF)</w:t>
+            <w:tcW w:w="5012" w:type="dxa"/>
+          </w:tcPr>
+          <w:p>
+            <w:pPr>
+              <w:pStyle w:val="TableText"/>
+            </w:pPr>
+            <w:r>
+              <w:t xml:space="preserve">Download General English (2017) (PDF)</w:t>
+            </w:r>
+            <w:r>
+              <w:rPr>
+                <w:sz w:val="18"/>
+              </w:rPr>
+              <w:t xml:space="preserve"> (https://drive.google.com/uc?export=download&amp;id=0B5Dat0QJWfuUbkhpa0RHRWM4NXM&amp;resourcekey=0-GkdNq03ksCxbWidqsa4H6Q)</w:t>
+            </w:r>
+            <w:r>
+              <w:t xml:space="preserve"> · </w:t>
+            </w:r>
+            <w:r>
+              <w:t xml:space="preserve">read online</w:t>
             </w:r>
             <w:r>
               <w:rPr>
@@ -3459,7 +3609,7 @@
         </w:trPr>
         <w:tc>
           <w:tcPr>
-            <w:tcW w:w="1443" w:type="dxa"/>
+            <w:tcW w:w="1336" w:type="dxa"/>
           </w:tcPr>
           <w:p>
             <w:pPr>
@@ -3472,7 +3622,7 @@
         </w:tc>
         <w:tc>
           <w:tcPr>
-            <w:tcW w:w="4060" w:type="dxa"/>
+            <w:tcW w:w="3758" w:type="dxa"/>
           </w:tcPr>
           <w:p>
             <w:pPr>
@@ -3485,7 +3635,7 @@
         </w:tc>
         <w:tc>
           <w:tcPr>
-            <w:tcW w:w="4603" w:type="dxa"/>
+            <w:tcW w:w="5012" w:type="dxa"/>
           </w:tcPr>
           <w:p>
             <w:pPr>
@@ -3509,7 +3659,7 @@
         </w:trPr>
         <w:tc>
           <w:tcPr>
-            <w:tcW w:w="1443" w:type="dxa"/>
+            <w:tcW w:w="1336" w:type="dxa"/>
           </w:tcPr>
           <w:p>
             <w:pPr>
@@ -3522,7 +3672,7 @@
         </w:tc>
         <w:tc>
           <w:tcPr>
-            <w:tcW w:w="4060" w:type="dxa"/>
+            <w:tcW w:w="3758" w:type="dxa"/>
           </w:tcPr>
           <w:p>
             <w:pPr>
@@ -3535,7 +3685,7 @@
         </w:tc>
         <w:tc>
           <w:tcPr>
-            <w:tcW w:w="4603" w:type="dxa"/>
+            <w:tcW w:w="5012" w:type="dxa"/>
           </w:tcPr>
           <w:p>
             <w:pPr>
@@ -3559,7 +3709,7 @@
         </w:trPr>
         <w:tc>
           <w:tcPr>
-            <w:tcW w:w="1443" w:type="dxa"/>
+            <w:tcW w:w="1336" w:type="dxa"/>
           </w:tcPr>
           <w:p>
             <w:pPr>
@@ -3572,7 +3722,7 @@
         </w:tc>
         <w:tc>
           <w:tcPr>
-            <w:tcW w:w="4060" w:type="dxa"/>
+            <w:tcW w:w="3758" w:type="dxa"/>
           </w:tcPr>
           <w:p>
             <w:pPr>
@@ -3585,7 +3735,7 @@
         </w:tc>
         <w:tc>
           <w:tcPr>
-            <w:tcW w:w="4603" w:type="dxa"/>
+            <w:tcW w:w="5012" w:type="dxa"/>
           </w:tcPr>
           <w:p>
             <w:pPr>

</xml_diff>

<commit_message>
List whole books only, never single chapters
The department publishes the Grade 7 Reading Book and the Grade 10 Pupil's
Book one unit at a time. Sending teachers to ten or fourteen separate files
is not useful, so those tables are gone and the books are not listed at all;
the "what is not on the official sites" table says why. The Grade 5 workbook
parts go too, since the complete workbook is listed.

Every remaining row is a whole book: 22 books and 18 Teachers' Guides,
all 64 links checked.

Co-Authored-By: Claude Opus 5 <noreply@anthropic.com>
</commit_message>
<xml_diff>
--- a/assets/downloads/teacher/rcf-english-textbooks-and-teacher-guides.docx
+++ b/assets/downloads/teacher/rcf-english-textbooks-and-teacher-guides.docx
@@ -161,7 +161,16 @@
         <w:keepNext/>
       </w:pPr>
       <w:r>
-        <w:t xml:space="preserve">Published by the Educational Publications Department. Grades 1 and 2 follow Activity Based Oral English (ABOE), so they have an Activity Book and a Song Book instead of a Pupil's Book.</w:t>
+        <w:t xml:space="preserve">Published by the Educational Publications Department. Every link here is a </w:t>
+      </w:r>
+      <w:r>
+        <w:rPr>
+          <w:b/>
+        </w:rPr>
+        <w:t xml:space="preserve">whole book</w:t>
+      </w:r>
+      <w:r>
+        <w:t xml:space="preserve">: where the department only publishes a book one unit at a time, we leave it out rather than send you to fourteen separate files. Grades 1 and 2 follow Activity Based Oral English (ABOE), so they have an Activity Book and a Song Book instead of a Pupil's Book.</w:t>
       </w:r>
     </w:p>
     <w:tbl>
@@ -830,7 +839,7 @@
               <w:pStyle w:val="TableText"/>
             </w:pPr>
             <w:r>
-              <w:t xml:space="preserve">Grade 5</w:t>
+              <w:t xml:space="preserve">Grade 6</w:t>
             </w:r>
           </w:p>
         </w:tc>
@@ -843,7 +852,7 @@
               <w:pStyle w:val="TableText"/>
             </w:pPr>
             <w:r>
-              <w:t xml:space="preserve">Workbook Part I (earlier edition)</w:t>
+              <w:t xml:space="preserve">Pupil's Book</w:t>
             </w:r>
           </w:p>
         </w:tc>
@@ -856,13 +865,37 @@
               <w:pStyle w:val="TableText"/>
             </w:pPr>
             <w:r>
-              <w:t xml:space="preserve">Workbook Part I (earlier edition) (PDF)</w:t>
-            </w:r>
-            <w:r>
-              <w:rPr>
-                <w:sz w:val="18"/>
-              </w:rPr>
-              <w:t xml:space="preserve"> (http://www.edupub.gov.lk/Administrator/English/5/english%20wb%20G-5%20P-I/English%20WB%20Gra.-5%20Part-I.pdf)</w:t>
+              <w:t xml:space="preserve">Download Pupil's Book (PDF)</w:t>
+            </w:r>
+            <w:r>
+              <w:rPr>
+                <w:sz w:val="18"/>
+              </w:rPr>
+              <w:t xml:space="preserve"> (https://drive.google.com/uc?export=download&amp;id=1Ta5sHpYrp23ywq4HugdEG1BrqB8tWCdl)</w:t>
+            </w:r>
+            <w:r>
+              <w:t xml:space="preserve"> · </w:t>
+            </w:r>
+            <w:r>
+              <w:t xml:space="preserve">read online</w:t>
+            </w:r>
+            <w:r>
+              <w:rPr>
+                <w:sz w:val="18"/>
+              </w:rPr>
+              <w:t xml:space="preserve"> (https://drive.google.com/file/d/1Ta5sHpYrp23ywq4HugdEG1BrqB8tWCdl/view)</w:t>
+            </w:r>
+            <w:r>
+              <w:t xml:space="preserve"> · </w:t>
+            </w:r>
+            <w:r>
+              <w:t xml:space="preserve">department copy</w:t>
+            </w:r>
+            <w:r>
+              <w:rPr>
+                <w:sz w:val="18"/>
+              </w:rPr>
+              <w:t xml:space="preserve"> (http://www.edupub.gov.lk/Administrator/English/6/english%20PB%20G-6/english%20PB%20G-6.pdf)</w:t>
             </w:r>
           </w:p>
         </w:tc>
@@ -880,7 +913,7 @@
               <w:pStyle w:val="TableText"/>
             </w:pPr>
             <w:r>
-              <w:t xml:space="preserve">Grade 5</w:t>
+              <w:t xml:space="preserve">Grade 6</w:t>
             </w:r>
           </w:p>
         </w:tc>
@@ -893,7 +926,7 @@
               <w:pStyle w:val="TableText"/>
             </w:pPr>
             <w:r>
-              <w:t xml:space="preserve">Workbook Part II (earlier edition)</w:t>
+              <w:t xml:space="preserve">Workbook</w:t>
             </w:r>
           </w:p>
         </w:tc>
@@ -906,13 +939,13 @@
               <w:pStyle w:val="TableText"/>
             </w:pPr>
             <w:r>
-              <w:t xml:space="preserve">Workbook Part II (earlier edition) (PDF)</w:t>
-            </w:r>
-            <w:r>
-              <w:rPr>
-                <w:sz w:val="18"/>
-              </w:rPr>
-              <w:t xml:space="preserve"> (http://www.edupub.gov.lk/Administrator/English/5/english%20wb%20G-5%20P-II/English%20WB%20Gra.-5%20Part%20-II.pdf)</w:t>
+              <w:t xml:space="preserve">Workbook (PDF)</w:t>
+            </w:r>
+            <w:r>
+              <w:rPr>
+                <w:sz w:val="18"/>
+              </w:rPr>
+              <w:t xml:space="preserve"> (http://www.edupub.gov.lk/Administrator/English/6/english%20wb%20G-6/A94779_ENGLISH%20WORKBOOK%20-%20GRADE%2006.pdf)</w:t>
             </w:r>
           </w:p>
         </w:tc>
@@ -930,7 +963,7 @@
               <w:pStyle w:val="TableText"/>
             </w:pPr>
             <w:r>
-              <w:t xml:space="preserve">Grade 6</w:t>
+              <w:t xml:space="preserve">Grade 7</w:t>
             </w:r>
           </w:p>
         </w:tc>
@@ -943,6 +976,56 @@
               <w:pStyle w:val="TableText"/>
             </w:pPr>
             <w:r>
+              <w:t xml:space="preserve">Workbook</w:t>
+            </w:r>
+          </w:p>
+        </w:tc>
+        <w:tc>
+          <w:tcPr>
+            <w:tcW w:w="5680" w:type="dxa"/>
+          </w:tcPr>
+          <w:p>
+            <w:pPr>
+              <w:pStyle w:val="TableText"/>
+            </w:pPr>
+            <w:r>
+              <w:t xml:space="preserve">Workbook (PDF)</w:t>
+            </w:r>
+            <w:r>
+              <w:rPr>
+                <w:sz w:val="18"/>
+              </w:rPr>
+              <w:t xml:space="preserve"> (http://www.edupub.gov.lk/Administrator/English/7/en%20wb%20g-7/en%20WB%20G-7.pdf)</w:t>
+            </w:r>
+          </w:p>
+        </w:tc>
+      </w:tr>
+      <w:tr>
+        <w:trPr>
+          <w:cantSplit/>
+        </w:trPr>
+        <w:tc>
+          <w:tcPr>
+            <w:tcW w:w="769" w:type="dxa"/>
+          </w:tcPr>
+          <w:p>
+            <w:pPr>
+              <w:pStyle w:val="TableText"/>
+            </w:pPr>
+            <w:r>
+              <w:t xml:space="preserve">Grade 8</w:t>
+            </w:r>
+          </w:p>
+        </w:tc>
+        <w:tc>
+          <w:tcPr>
+            <w:tcW w:w="3657" w:type="dxa"/>
+          </w:tcPr>
+          <w:p>
+            <w:pPr>
+              <w:pStyle w:val="TableText"/>
+            </w:pPr>
+            <w:r>
               <w:t xml:space="preserve">Pupil's Book</w:t>
             </w:r>
           </w:p>
@@ -956,13 +1039,113 @@
               <w:pStyle w:val="TableText"/>
             </w:pPr>
             <w:r>
+              <w:t xml:space="preserve">Pupil's Book (PDF)</w:t>
+            </w:r>
+            <w:r>
+              <w:rPr>
+                <w:sz w:val="18"/>
+              </w:rPr>
+              <w:t xml:space="preserve"> (http://www.edupub.gov.lk/Administrator/English/8/en%20pb%20g-8/en%20PB%20g-8.pdf)</w:t>
+            </w:r>
+          </w:p>
+        </w:tc>
+      </w:tr>
+      <w:tr>
+        <w:trPr>
+          <w:cantSplit/>
+        </w:trPr>
+        <w:tc>
+          <w:tcPr>
+            <w:tcW w:w="769" w:type="dxa"/>
+          </w:tcPr>
+          <w:p>
+            <w:pPr>
+              <w:pStyle w:val="TableText"/>
+            </w:pPr>
+            <w:r>
+              <w:t xml:space="preserve">Grade 8</w:t>
+            </w:r>
+          </w:p>
+        </w:tc>
+        <w:tc>
+          <w:tcPr>
+            <w:tcW w:w="3657" w:type="dxa"/>
+          </w:tcPr>
+          <w:p>
+            <w:pPr>
+              <w:pStyle w:val="TableText"/>
+            </w:pPr>
+            <w:r>
+              <w:t xml:space="preserve">Workbook</w:t>
+            </w:r>
+          </w:p>
+        </w:tc>
+        <w:tc>
+          <w:tcPr>
+            <w:tcW w:w="5680" w:type="dxa"/>
+          </w:tcPr>
+          <w:p>
+            <w:pPr>
+              <w:pStyle w:val="TableText"/>
+            </w:pPr>
+            <w:r>
+              <w:t xml:space="preserve">Workbook (PDF)</w:t>
+            </w:r>
+            <w:r>
+              <w:rPr>
+                <w:sz w:val="18"/>
+              </w:rPr>
+              <w:t xml:space="preserve"> (http://www.edupub.gov.lk/Administrator/English/8/en%20wb%20g-8/english%20WB%20g-8.pdf)</w:t>
+            </w:r>
+          </w:p>
+        </w:tc>
+      </w:tr>
+      <w:tr>
+        <w:trPr>
+          <w:cantSplit/>
+        </w:trPr>
+        <w:tc>
+          <w:tcPr>
+            <w:tcW w:w="769" w:type="dxa"/>
+          </w:tcPr>
+          <w:p>
+            <w:pPr>
+              <w:pStyle w:val="TableText"/>
+            </w:pPr>
+            <w:r>
+              <w:t xml:space="preserve">Grade 9</w:t>
+            </w:r>
+          </w:p>
+        </w:tc>
+        <w:tc>
+          <w:tcPr>
+            <w:tcW w:w="3657" w:type="dxa"/>
+          </w:tcPr>
+          <w:p>
+            <w:pPr>
+              <w:pStyle w:val="TableText"/>
+            </w:pPr>
+            <w:r>
+              <w:t xml:space="preserve">Pupil's Book</w:t>
+            </w:r>
+          </w:p>
+        </w:tc>
+        <w:tc>
+          <w:tcPr>
+            <w:tcW w:w="5680" w:type="dxa"/>
+          </w:tcPr>
+          <w:p>
+            <w:pPr>
+              <w:pStyle w:val="TableText"/>
+            </w:pPr>
+            <w:r>
               <w:t xml:space="preserve">Download Pupil's Book (PDF)</w:t>
             </w:r>
             <w:r>
               <w:rPr>
                 <w:sz w:val="18"/>
               </w:rPr>
-              <w:t xml:space="preserve"> (https://drive.google.com/uc?export=download&amp;id=1Ta5sHpYrp23ywq4HugdEG1BrqB8tWCdl)</w:t>
+              <w:t xml:space="preserve"> (https://drive.google.com/uc?export=download&amp;id=16q5Qcc5jNowFBg-u04rAAXIEE1IgnouF)</w:t>
             </w:r>
             <w:r>
               <w:t xml:space="preserve"> · </w:t>
@@ -974,7 +1157,7 @@
               <w:rPr>
                 <w:sz w:val="18"/>
               </w:rPr>
-              <w:t xml:space="preserve"> (https://drive.google.com/file/d/1Ta5sHpYrp23ywq4HugdEG1BrqB8tWCdl/view)</w:t>
+              <w:t xml:space="preserve"> (https://drive.google.com/file/d/16q5Qcc5jNowFBg-u04rAAXIEE1IgnouF/view)</w:t>
             </w:r>
             <w:r>
               <w:t xml:space="preserve"> · </w:t>
@@ -986,7 +1169,7 @@
               <w:rPr>
                 <w:sz w:val="18"/>
               </w:rPr>
-              <w:t xml:space="preserve"> (http://www.edupub.gov.lk/Administrator/English/6/english%20PB%20G-6/english%20PB%20G-6.pdf)</w:t>
+              <w:t xml:space="preserve"> (http://www.edupub.gov.lk/Administrator/English/9/en%20pb%20g-9/english%20pb%20G-9.pdf)</w:t>
             </w:r>
           </w:p>
         </w:tc>
@@ -1004,7 +1187,7 @@
               <w:pStyle w:val="TableText"/>
             </w:pPr>
             <w:r>
-              <w:t xml:space="preserve">Grade 6</w:t>
+              <w:t xml:space="preserve">Grade 9</w:t>
             </w:r>
           </w:p>
         </w:tc>
@@ -1036,7 +1219,7 @@
               <w:rPr>
                 <w:sz w:val="18"/>
               </w:rPr>
-              <w:t xml:space="preserve"> (http://www.edupub.gov.lk/Administrator/English/6/english%20wb%20G-6/A94779_ENGLISH%20WORKBOOK%20-%20GRADE%2006.pdf)</w:t>
+              <w:t xml:space="preserve"> (http://www.edupub.gov.lk/Administrator/English/9/en%20wb%20g-9/en%20wb%20g-9.pdf)</w:t>
             </w:r>
           </w:p>
         </w:tc>
@@ -1054,7 +1237,7 @@
               <w:pStyle w:val="TableText"/>
             </w:pPr>
             <w:r>
-              <w:t xml:space="preserve">Grade 7</w:t>
+              <w:t xml:space="preserve">Grade 10</w:t>
             </w:r>
           </w:p>
         </w:tc>
@@ -1086,7 +1269,7 @@
               <w:rPr>
                 <w:sz w:val="18"/>
               </w:rPr>
-              <w:t xml:space="preserve"> (http://www.edupub.gov.lk/Administrator/English/7/en%20wb%20g-7/en%20WB%20G-7.pdf)</w:t>
+              <w:t xml:space="preserve"> (http://www.edupub.gov.lk/Administrator/English/10/English%20Work%20Book%20G%2010%20E/english%20WB%20G-10.pdf)</w:t>
             </w:r>
           </w:p>
         </w:tc>
@@ -1104,7 +1287,7 @@
               <w:pStyle w:val="TableText"/>
             </w:pPr>
             <w:r>
-              <w:t xml:space="preserve">Grade 8</w:t>
+              <w:t xml:space="preserve">Grade 10</w:t>
             </w:r>
           </w:p>
         </w:tc>
@@ -1117,6 +1300,56 @@
               <w:pStyle w:val="TableText"/>
             </w:pPr>
             <w:r>
+              <w:t xml:space="preserve">Appreciation of English Literary Texts</w:t>
+            </w:r>
+          </w:p>
+        </w:tc>
+        <w:tc>
+          <w:tcPr>
+            <w:tcW w:w="5680" w:type="dxa"/>
+          </w:tcPr>
+          <w:p>
+            <w:pPr>
+              <w:pStyle w:val="TableText"/>
+            </w:pPr>
+            <w:r>
+              <w:t xml:space="preserve">Appreciation of English Literary Texts (PDF)</w:t>
+            </w:r>
+            <w:r>
+              <w:rPr>
+                <w:sz w:val="18"/>
+              </w:rPr>
+              <w:t xml:space="preserve"> (http://www.edupub.gov.lk/Administrator/English/10/en%20ap%20g-10/English%20Literary%20texts.pdf)</w:t>
+            </w:r>
+          </w:p>
+        </w:tc>
+      </w:tr>
+      <w:tr>
+        <w:trPr>
+          <w:cantSplit/>
+        </w:trPr>
+        <w:tc>
+          <w:tcPr>
+            <w:tcW w:w="769" w:type="dxa"/>
+          </w:tcPr>
+          <w:p>
+            <w:pPr>
+              <w:pStyle w:val="TableText"/>
+            </w:pPr>
+            <w:r>
+              <w:t xml:space="preserve">Grade 11</w:t>
+            </w:r>
+          </w:p>
+        </w:tc>
+        <w:tc>
+          <w:tcPr>
+            <w:tcW w:w="3657" w:type="dxa"/>
+          </w:tcPr>
+          <w:p>
+            <w:pPr>
+              <w:pStyle w:val="TableText"/>
+            </w:pPr>
+            <w:r>
               <w:t xml:space="preserve">Pupil's Book</w:t>
             </w:r>
           </w:p>
@@ -1136,7 +1369,7 @@
               <w:rPr>
                 <w:sz w:val="18"/>
               </w:rPr>
-              <w:t xml:space="preserve"> (http://www.edupub.gov.lk/Administrator/English/8/en%20pb%20g-8/en%20PB%20g-8.pdf)</w:t>
+              <w:t xml:space="preserve"> (http://www.edupub.gov.lk/Administrator/English/11/english%20PB%20G-11/book.pdf)</w:t>
             </w:r>
           </w:p>
         </w:tc>
@@ -1154,7 +1387,7 @@
               <w:pStyle w:val="TableText"/>
             </w:pPr>
             <w:r>
-              <w:t xml:space="preserve">Grade 8</w:t>
+              <w:t xml:space="preserve">Grade 11</w:t>
             </w:r>
           </w:p>
         </w:tc>
@@ -1186,1379 +1419,7 @@
               <w:rPr>
                 <w:sz w:val="18"/>
               </w:rPr>
-              <w:t xml:space="preserve"> (http://www.edupub.gov.lk/Administrator/English/8/en%20wb%20g-8/english%20WB%20g-8.pdf)</w:t>
-            </w:r>
-          </w:p>
-        </w:tc>
-      </w:tr>
-      <w:tr>
-        <w:trPr>
-          <w:cantSplit/>
-        </w:trPr>
-        <w:tc>
-          <w:tcPr>
-            <w:tcW w:w="769" w:type="dxa"/>
-          </w:tcPr>
-          <w:p>
-            <w:pPr>
-              <w:pStyle w:val="TableText"/>
-            </w:pPr>
-            <w:r>
-              <w:t xml:space="preserve">Grade 9</w:t>
-            </w:r>
-          </w:p>
-        </w:tc>
-        <w:tc>
-          <w:tcPr>
-            <w:tcW w:w="3657" w:type="dxa"/>
-          </w:tcPr>
-          <w:p>
-            <w:pPr>
-              <w:pStyle w:val="TableText"/>
-            </w:pPr>
-            <w:r>
-              <w:t xml:space="preserve">Pupil's Book</w:t>
-            </w:r>
-          </w:p>
-        </w:tc>
-        <w:tc>
-          <w:tcPr>
-            <w:tcW w:w="5680" w:type="dxa"/>
-          </w:tcPr>
-          <w:p>
-            <w:pPr>
-              <w:pStyle w:val="TableText"/>
-            </w:pPr>
-            <w:r>
-              <w:t xml:space="preserve">Download Pupil's Book (PDF)</w:t>
-            </w:r>
-            <w:r>
-              <w:rPr>
-                <w:sz w:val="18"/>
-              </w:rPr>
-              <w:t xml:space="preserve"> (https://drive.google.com/uc?export=download&amp;id=16q5Qcc5jNowFBg-u04rAAXIEE1IgnouF)</w:t>
-            </w:r>
-            <w:r>
-              <w:t xml:space="preserve"> · </w:t>
-            </w:r>
-            <w:r>
-              <w:t xml:space="preserve">read online</w:t>
-            </w:r>
-            <w:r>
-              <w:rPr>
-                <w:sz w:val="18"/>
-              </w:rPr>
-              <w:t xml:space="preserve"> (https://drive.google.com/file/d/16q5Qcc5jNowFBg-u04rAAXIEE1IgnouF/view)</w:t>
-            </w:r>
-            <w:r>
-              <w:t xml:space="preserve"> · </w:t>
-            </w:r>
-            <w:r>
-              <w:t xml:space="preserve">department copy</w:t>
-            </w:r>
-            <w:r>
-              <w:rPr>
-                <w:sz w:val="18"/>
-              </w:rPr>
-              <w:t xml:space="preserve"> (http://www.edupub.gov.lk/Administrator/English/9/en%20pb%20g-9/english%20pb%20G-9.pdf)</w:t>
-            </w:r>
-          </w:p>
-        </w:tc>
-      </w:tr>
-      <w:tr>
-        <w:trPr>
-          <w:cantSplit/>
-        </w:trPr>
-        <w:tc>
-          <w:tcPr>
-            <w:tcW w:w="769" w:type="dxa"/>
-          </w:tcPr>
-          <w:p>
-            <w:pPr>
-              <w:pStyle w:val="TableText"/>
-            </w:pPr>
-            <w:r>
-              <w:t xml:space="preserve">Grade 9</w:t>
-            </w:r>
-          </w:p>
-        </w:tc>
-        <w:tc>
-          <w:tcPr>
-            <w:tcW w:w="3657" w:type="dxa"/>
-          </w:tcPr>
-          <w:p>
-            <w:pPr>
-              <w:pStyle w:val="TableText"/>
-            </w:pPr>
-            <w:r>
-              <w:t xml:space="preserve">Workbook</w:t>
-            </w:r>
-          </w:p>
-        </w:tc>
-        <w:tc>
-          <w:tcPr>
-            <w:tcW w:w="5680" w:type="dxa"/>
-          </w:tcPr>
-          <w:p>
-            <w:pPr>
-              <w:pStyle w:val="TableText"/>
-            </w:pPr>
-            <w:r>
-              <w:t xml:space="preserve">Workbook (PDF)</w:t>
-            </w:r>
-            <w:r>
-              <w:rPr>
-                <w:sz w:val="18"/>
-              </w:rPr>
-              <w:t xml:space="preserve"> (http://www.edupub.gov.lk/Administrator/English/9/en%20wb%20g-9/en%20wb%20g-9.pdf)</w:t>
-            </w:r>
-          </w:p>
-        </w:tc>
-      </w:tr>
-      <w:tr>
-        <w:trPr>
-          <w:cantSplit/>
-        </w:trPr>
-        <w:tc>
-          <w:tcPr>
-            <w:tcW w:w="769" w:type="dxa"/>
-          </w:tcPr>
-          <w:p>
-            <w:pPr>
-              <w:pStyle w:val="TableText"/>
-            </w:pPr>
-            <w:r>
-              <w:t xml:space="preserve">Grade 10</w:t>
-            </w:r>
-          </w:p>
-        </w:tc>
-        <w:tc>
-          <w:tcPr>
-            <w:tcW w:w="3657" w:type="dxa"/>
-          </w:tcPr>
-          <w:p>
-            <w:pPr>
-              <w:pStyle w:val="TableText"/>
-            </w:pPr>
-            <w:r>
-              <w:t xml:space="preserve">Workbook</w:t>
-            </w:r>
-          </w:p>
-        </w:tc>
-        <w:tc>
-          <w:tcPr>
-            <w:tcW w:w="5680" w:type="dxa"/>
-          </w:tcPr>
-          <w:p>
-            <w:pPr>
-              <w:pStyle w:val="TableText"/>
-            </w:pPr>
-            <w:r>
-              <w:t xml:space="preserve">Workbook (PDF)</w:t>
-            </w:r>
-            <w:r>
-              <w:rPr>
-                <w:sz w:val="18"/>
-              </w:rPr>
-              <w:t xml:space="preserve"> (http://www.edupub.gov.lk/Administrator/English/10/English%20Work%20Book%20G%2010%20E/english%20WB%20G-10.pdf)</w:t>
-            </w:r>
-          </w:p>
-        </w:tc>
-      </w:tr>
-      <w:tr>
-        <w:trPr>
-          <w:cantSplit/>
-        </w:trPr>
-        <w:tc>
-          <w:tcPr>
-            <w:tcW w:w="769" w:type="dxa"/>
-          </w:tcPr>
-          <w:p>
-            <w:pPr>
-              <w:pStyle w:val="TableText"/>
-            </w:pPr>
-            <w:r>
-              <w:t xml:space="preserve">Grade 10</w:t>
-            </w:r>
-          </w:p>
-        </w:tc>
-        <w:tc>
-          <w:tcPr>
-            <w:tcW w:w="3657" w:type="dxa"/>
-          </w:tcPr>
-          <w:p>
-            <w:pPr>
-              <w:pStyle w:val="TableText"/>
-            </w:pPr>
-            <w:r>
-              <w:t xml:space="preserve">Appreciation of English Literary Texts</w:t>
-            </w:r>
-          </w:p>
-        </w:tc>
-        <w:tc>
-          <w:tcPr>
-            <w:tcW w:w="5680" w:type="dxa"/>
-          </w:tcPr>
-          <w:p>
-            <w:pPr>
-              <w:pStyle w:val="TableText"/>
-            </w:pPr>
-            <w:r>
-              <w:t xml:space="preserve">Appreciation of English Literary Texts (PDF)</w:t>
-            </w:r>
-            <w:r>
-              <w:rPr>
-                <w:sz w:val="18"/>
-              </w:rPr>
-              <w:t xml:space="preserve"> (http://www.edupub.gov.lk/Administrator/English/10/en%20ap%20g-10/English%20Literary%20texts.pdf)</w:t>
-            </w:r>
-          </w:p>
-        </w:tc>
-      </w:tr>
-      <w:tr>
-        <w:trPr>
-          <w:cantSplit/>
-        </w:trPr>
-        <w:tc>
-          <w:tcPr>
-            <w:tcW w:w="769" w:type="dxa"/>
-          </w:tcPr>
-          <w:p>
-            <w:pPr>
-              <w:pStyle w:val="TableText"/>
-            </w:pPr>
-            <w:r>
-              <w:t xml:space="preserve">Grade 11</w:t>
-            </w:r>
-          </w:p>
-        </w:tc>
-        <w:tc>
-          <w:tcPr>
-            <w:tcW w:w="3657" w:type="dxa"/>
-          </w:tcPr>
-          <w:p>
-            <w:pPr>
-              <w:pStyle w:val="TableText"/>
-            </w:pPr>
-            <w:r>
-              <w:t xml:space="preserve">Pupil's Book</w:t>
-            </w:r>
-          </w:p>
-        </w:tc>
-        <w:tc>
-          <w:tcPr>
-            <w:tcW w:w="5680" w:type="dxa"/>
-          </w:tcPr>
-          <w:p>
-            <w:pPr>
-              <w:pStyle w:val="TableText"/>
-            </w:pPr>
-            <w:r>
-              <w:t xml:space="preserve">Pupil's Book (PDF)</w:t>
-            </w:r>
-            <w:r>
-              <w:rPr>
-                <w:sz w:val="18"/>
-              </w:rPr>
-              <w:t xml:space="preserve"> (http://www.edupub.gov.lk/Administrator/English/11/english%20PB%20G-11/book.pdf)</w:t>
-            </w:r>
-          </w:p>
-        </w:tc>
-      </w:tr>
-      <w:tr>
-        <w:trPr>
-          <w:cantSplit/>
-        </w:trPr>
-        <w:tc>
-          <w:tcPr>
-            <w:tcW w:w="769" w:type="dxa"/>
-          </w:tcPr>
-          <w:p>
-            <w:pPr>
-              <w:pStyle w:val="TableText"/>
-            </w:pPr>
-            <w:r>
-              <w:t xml:space="preserve">Grade 11</w:t>
-            </w:r>
-          </w:p>
-        </w:tc>
-        <w:tc>
-          <w:tcPr>
-            <w:tcW w:w="3657" w:type="dxa"/>
-          </w:tcPr>
-          <w:p>
-            <w:pPr>
-              <w:pStyle w:val="TableText"/>
-            </w:pPr>
-            <w:r>
-              <w:t xml:space="preserve">Workbook</w:t>
-            </w:r>
-          </w:p>
-        </w:tc>
-        <w:tc>
-          <w:tcPr>
-            <w:tcW w:w="5680" w:type="dxa"/>
-          </w:tcPr>
-          <w:p>
-            <w:pPr>
-              <w:pStyle w:val="TableText"/>
-            </w:pPr>
-            <w:r>
-              <w:t xml:space="preserve">Workbook (PDF)</w:t>
-            </w:r>
-            <w:r>
-              <w:rPr>
-                <w:sz w:val="18"/>
-              </w:rPr>
               <w:t xml:space="preserve"> (http://www.edupub.gov.lk/Administrator/English/11/en%20wb%20g-11/english%20WBg-11.pdf)</w:t>
-            </w:r>
-          </w:p>
-        </w:tc>
-      </w:tr>
-    </w:tbl>
-    <w:p/>
-    <w:p>
-      <w:pPr>
-        <w:pStyle w:val="Heading2"/>
-        <w:keepNext/>
-      </w:pPr>
-      <w:r>
-        <w:t xml:space="preserve">Grade 7 English Reading Book</w:t>
-      </w:r>
-    </w:p>
-    <w:p>
-      <w:pPr>
-        <w:keepNext/>
-      </w:pPr>
-      <w:r>
-        <w:t xml:space="preserve">The department publishes this book one unit at a time.</w:t>
-      </w:r>
-    </w:p>
-    <w:tbl>
-      <w:tblPr>
-        <w:tblW w:w="10106" w:type="dxa"/>
-        <w:tblBorders>
-          <w:top w:val="single" w:sz="4" w:space="0" w:color="8FA3BF"/>
-          <w:left w:val="single" w:sz="4" w:space="0" w:color="8FA3BF"/>
-          <w:bottom w:val="single" w:sz="4" w:space="0" w:color="8FA3BF"/>
-          <w:right w:val="single" w:sz="4" w:space="0" w:color="8FA3BF"/>
-          <w:insideH w:val="single" w:sz="4" w:space="0" w:color="8FA3BF"/>
-          <w:insideV w:val="single" w:sz="4" w:space="0" w:color="8FA3BF"/>
-        </w:tblBorders>
-        <w:tblLayout w:type="fixed"/>
-        <w:tblCellMar>
-          <w:left w:w="80" w:type="dxa"/>
-          <w:right w:w="80" w:type="dxa"/>
-        </w:tblCellMar>
-      </w:tblPr>
-      <w:tblGrid>
-        <w:gridCol w:w="7978"/>
-        <w:gridCol w:w="2128"/>
-      </w:tblGrid>
-      <w:tr>
-        <w:trPr>
-          <w:tblHeader/>
-          <w:cantSplit/>
-        </w:trPr>
-        <w:tc>
-          <w:tcPr>
-            <w:tcW w:w="7978" w:type="dxa"/>
-            <w:shd w:val="clear" w:color="auto" w:fill="DCE6F2"/>
-          </w:tcPr>
-          <w:p>
-            <w:pPr>
-              <w:pStyle w:val="TableText"/>
-            </w:pPr>
-            <w:r>
-              <w:rPr>
-                <w:b/>
-              </w:rPr>
-              <w:t xml:space="preserve">Unit</w:t>
-            </w:r>
-          </w:p>
-        </w:tc>
-        <w:tc>
-          <w:tcPr>
-            <w:tcW w:w="2128" w:type="dxa"/>
-            <w:shd w:val="clear" w:color="auto" w:fill="DCE6F2"/>
-          </w:tcPr>
-          <w:p>
-            <w:pPr>
-              <w:pStyle w:val="TableText"/>
-            </w:pPr>
-            <w:r>
-              <w:rPr>
-                <w:b/>
-              </w:rPr>
-              <w:t xml:space="preserve">Download</w:t>
-            </w:r>
-          </w:p>
-        </w:tc>
-      </w:tr>
-      <w:tr>
-        <w:trPr>
-          <w:cantSplit/>
-        </w:trPr>
-        <w:tc>
-          <w:tcPr>
-            <w:tcW w:w="7978" w:type="dxa"/>
-          </w:tcPr>
-          <w:p>
-            <w:pPr>
-              <w:pStyle w:val="TableText"/>
-            </w:pPr>
-            <w:r>
-              <w:t xml:space="preserve">Unit 1: What You See</w:t>
-            </w:r>
-          </w:p>
-        </w:tc>
-        <w:tc>
-          <w:tcPr>
-            <w:tcW w:w="2128" w:type="dxa"/>
-          </w:tcPr>
-          <w:p>
-            <w:pPr>
-              <w:pStyle w:val="TableText"/>
-            </w:pPr>
-            <w:r>
-              <w:t xml:space="preserve">PDF</w:t>
-            </w:r>
-            <w:r>
-              <w:rPr>
-                <w:sz w:val="18"/>
-              </w:rPr>
-              <w:t xml:space="preserve"> (http://www.edupub.gov.lk/Administrator/English/7/English%20Reading%20Book%20G7/Unit%201%20-%20What%20You%20see%20-%20ok.pdf)</w:t>
-            </w:r>
-          </w:p>
-        </w:tc>
-      </w:tr>
-      <w:tr>
-        <w:trPr>
-          <w:cantSplit/>
-        </w:trPr>
-        <w:tc>
-          <w:tcPr>
-            <w:tcW w:w="7978" w:type="dxa"/>
-          </w:tcPr>
-          <w:p>
-            <w:pPr>
-              <w:pStyle w:val="TableText"/>
-            </w:pPr>
-            <w:r>
-              <w:t xml:space="preserve">Unit 2: Friends Indeed</w:t>
-            </w:r>
-          </w:p>
-        </w:tc>
-        <w:tc>
-          <w:tcPr>
-            <w:tcW w:w="2128" w:type="dxa"/>
-          </w:tcPr>
-          <w:p>
-            <w:pPr>
-              <w:pStyle w:val="TableText"/>
-            </w:pPr>
-            <w:r>
-              <w:t xml:space="preserve">PDF</w:t>
-            </w:r>
-            <w:r>
-              <w:rPr>
-                <w:sz w:val="18"/>
-              </w:rPr>
-              <w:t xml:space="preserve"> (http://www.edupub.gov.lk/Administrator/English/7/English%20Reading%20Book%20G7/Unit%202%20-%20Friends%20In%20Deed%20-%20ok.pdf)</w:t>
-            </w:r>
-          </w:p>
-        </w:tc>
-      </w:tr>
-      <w:tr>
-        <w:trPr>
-          <w:cantSplit/>
-        </w:trPr>
-        <w:tc>
-          <w:tcPr>
-            <w:tcW w:w="7978" w:type="dxa"/>
-          </w:tcPr>
-          <w:p>
-            <w:pPr>
-              <w:pStyle w:val="TableText"/>
-            </w:pPr>
-            <w:r>
-              <w:t xml:space="preserve">Unit 3: Pleasure</w:t>
-            </w:r>
-          </w:p>
-        </w:tc>
-        <w:tc>
-          <w:tcPr>
-            <w:tcW w:w="2128" w:type="dxa"/>
-          </w:tcPr>
-          <w:p>
-            <w:pPr>
-              <w:pStyle w:val="TableText"/>
-            </w:pPr>
-            <w:r>
-              <w:t xml:space="preserve">PDF</w:t>
-            </w:r>
-            <w:r>
-              <w:rPr>
-                <w:sz w:val="18"/>
-              </w:rPr>
-              <w:t xml:space="preserve"> (http://www.edupub.gov.lk/Administrator/English/7/English%20Reading%20Book%20G7/Unit%203%20-%20pleasure%20-%20ok.pdf)</w:t>
-            </w:r>
-          </w:p>
-        </w:tc>
-      </w:tr>
-      <w:tr>
-        <w:trPr>
-          <w:cantSplit/>
-        </w:trPr>
-        <w:tc>
-          <w:tcPr>
-            <w:tcW w:w="7978" w:type="dxa"/>
-          </w:tcPr>
-          <w:p>
-            <w:pPr>
-              <w:pStyle w:val="TableText"/>
-            </w:pPr>
-            <w:r>
-              <w:t xml:space="preserve">Unit 4: A Busy Day</w:t>
-            </w:r>
-          </w:p>
-        </w:tc>
-        <w:tc>
-          <w:tcPr>
-            <w:tcW w:w="2128" w:type="dxa"/>
-          </w:tcPr>
-          <w:p>
-            <w:pPr>
-              <w:pStyle w:val="TableText"/>
-            </w:pPr>
-            <w:r>
-              <w:t xml:space="preserve">PDF</w:t>
-            </w:r>
-            <w:r>
-              <w:rPr>
-                <w:sz w:val="18"/>
-              </w:rPr>
-              <w:t xml:space="preserve"> (http://www.edupub.gov.lk/Administrator/English/7/English%20Reading%20Book%20G7/Unit%204%20-%20A%20busy%20day%20-%20ok.pdf)</w:t>
-            </w:r>
-          </w:p>
-        </w:tc>
-      </w:tr>
-      <w:tr>
-        <w:trPr>
-          <w:cantSplit/>
-        </w:trPr>
-        <w:tc>
-          <w:tcPr>
-            <w:tcW w:w="7978" w:type="dxa"/>
-          </w:tcPr>
-          <w:p>
-            <w:pPr>
-              <w:pStyle w:val="TableText"/>
-            </w:pPr>
-            <w:r>
-              <w:t xml:space="preserve">Unit 5: Once Upon a Time</w:t>
-            </w:r>
-          </w:p>
-        </w:tc>
-        <w:tc>
-          <w:tcPr>
-            <w:tcW w:w="2128" w:type="dxa"/>
-          </w:tcPr>
-          <w:p>
-            <w:pPr>
-              <w:pStyle w:val="TableText"/>
-            </w:pPr>
-            <w:r>
-              <w:t xml:space="preserve">PDF</w:t>
-            </w:r>
-            <w:r>
-              <w:rPr>
-                <w:sz w:val="18"/>
-              </w:rPr>
-              <w:t xml:space="preserve"> (http://www.edupub.gov.lk/Administrator/English/7/English%20Reading%20Book%20G7/Unit%205%20-%20once%20upon%20a%20time%20-%20ok.pdf)</w:t>
-            </w:r>
-          </w:p>
-        </w:tc>
-      </w:tr>
-      <w:tr>
-        <w:trPr>
-          <w:cantSplit/>
-        </w:trPr>
-        <w:tc>
-          <w:tcPr>
-            <w:tcW w:w="7978" w:type="dxa"/>
-          </w:tcPr>
-          <w:p>
-            <w:pPr>
-              <w:pStyle w:val="TableText"/>
-            </w:pPr>
-            <w:r>
-              <w:t xml:space="preserve">Unit 6: Better Safe Than Sorry</w:t>
-            </w:r>
-          </w:p>
-        </w:tc>
-        <w:tc>
-          <w:tcPr>
-            <w:tcW w:w="2128" w:type="dxa"/>
-          </w:tcPr>
-          <w:p>
-            <w:pPr>
-              <w:pStyle w:val="TableText"/>
-            </w:pPr>
-            <w:r>
-              <w:t xml:space="preserve">PDF</w:t>
-            </w:r>
-            <w:r>
-              <w:rPr>
-                <w:sz w:val="18"/>
-              </w:rPr>
-              <w:t xml:space="preserve"> (http://www.edupub.gov.lk/Administrator/English/7/English%20Reading%20Book%20G7/Unit%206%20-%20Better%20be%20safe%20than%20sorry%20-%20ok.pdf)</w:t>
-            </w:r>
-          </w:p>
-        </w:tc>
-      </w:tr>
-      <w:tr>
-        <w:trPr>
-          <w:cantSplit/>
-        </w:trPr>
-        <w:tc>
-          <w:tcPr>
-            <w:tcW w:w="7978" w:type="dxa"/>
-          </w:tcPr>
-          <w:p>
-            <w:pPr>
-              <w:pStyle w:val="TableText"/>
-            </w:pPr>
-            <w:r>
-              <w:t xml:space="preserve">Unit 7: Around the Country</w:t>
-            </w:r>
-          </w:p>
-        </w:tc>
-        <w:tc>
-          <w:tcPr>
-            <w:tcW w:w="2128" w:type="dxa"/>
-          </w:tcPr>
-          <w:p>
-            <w:pPr>
-              <w:pStyle w:val="TableText"/>
-            </w:pPr>
-            <w:r>
-              <w:t xml:space="preserve">PDF</w:t>
-            </w:r>
-            <w:r>
-              <w:rPr>
-                <w:sz w:val="18"/>
-              </w:rPr>
-              <w:t xml:space="preserve"> (http://www.edupub.gov.lk/Administrator/English/7/English%20Reading%20Book%20G7/Unit%207%20-%20Around%20the%20country%20-%20ok.pdf)</w:t>
-            </w:r>
-          </w:p>
-        </w:tc>
-      </w:tr>
-      <w:tr>
-        <w:trPr>
-          <w:cantSplit/>
-        </w:trPr>
-        <w:tc>
-          <w:tcPr>
-            <w:tcW w:w="7978" w:type="dxa"/>
-          </w:tcPr>
-          <w:p>
-            <w:pPr>
-              <w:pStyle w:val="TableText"/>
-            </w:pPr>
-            <w:r>
-              <w:t xml:space="preserve">Unit 8: Wonders Around Us</w:t>
-            </w:r>
-          </w:p>
-        </w:tc>
-        <w:tc>
-          <w:tcPr>
-            <w:tcW w:w="2128" w:type="dxa"/>
-          </w:tcPr>
-          <w:p>
-            <w:pPr>
-              <w:pStyle w:val="TableText"/>
-            </w:pPr>
-            <w:r>
-              <w:t xml:space="preserve">PDF</w:t>
-            </w:r>
-            <w:r>
-              <w:rPr>
-                <w:sz w:val="18"/>
-              </w:rPr>
-              <w:t xml:space="preserve"> (http://www.edupub.gov.lk/Administrator/English/7/English%20Reading%20Book%20G7/Unit%208%20-%20Wonders%20Around%20Us%20-%20ok.pdf)</w:t>
-            </w:r>
-          </w:p>
-        </w:tc>
-      </w:tr>
-      <w:tr>
-        <w:trPr>
-          <w:cantSplit/>
-        </w:trPr>
-        <w:tc>
-          <w:tcPr>
-            <w:tcW w:w="7978" w:type="dxa"/>
-          </w:tcPr>
-          <w:p>
-            <w:pPr>
-              <w:pStyle w:val="TableText"/>
-            </w:pPr>
-            <w:r>
-              <w:t xml:space="preserve">Unit 9: Our Beautiful World</w:t>
-            </w:r>
-          </w:p>
-        </w:tc>
-        <w:tc>
-          <w:tcPr>
-            <w:tcW w:w="2128" w:type="dxa"/>
-          </w:tcPr>
-          <w:p>
-            <w:pPr>
-              <w:pStyle w:val="TableText"/>
-            </w:pPr>
-            <w:r>
-              <w:t xml:space="preserve">PDF</w:t>
-            </w:r>
-            <w:r>
-              <w:rPr>
-                <w:sz w:val="18"/>
-              </w:rPr>
-              <w:t xml:space="preserve"> (http://www.edupub.gov.lk/Administrator/English/7/English%20Reading%20Book%20G7/Unit%209%20-%20our%20beautiful%20world%20-%20ok.pdf)</w:t>
-            </w:r>
-          </w:p>
-        </w:tc>
-      </w:tr>
-      <w:tr>
-        <w:trPr>
-          <w:cantSplit/>
-        </w:trPr>
-        <w:tc>
-          <w:tcPr>
-            <w:tcW w:w="7978" w:type="dxa"/>
-          </w:tcPr>
-          <w:p>
-            <w:pPr>
-              <w:pStyle w:val="TableText"/>
-            </w:pPr>
-            <w:r>
-              <w:t xml:space="preserve">Unit 10: Future</w:t>
-            </w:r>
-          </w:p>
-        </w:tc>
-        <w:tc>
-          <w:tcPr>
-            <w:tcW w:w="2128" w:type="dxa"/>
-          </w:tcPr>
-          <w:p>
-            <w:pPr>
-              <w:pStyle w:val="TableText"/>
-            </w:pPr>
-            <w:r>
-              <w:t xml:space="preserve">PDF</w:t>
-            </w:r>
-            <w:r>
-              <w:rPr>
-                <w:sz w:val="18"/>
-              </w:rPr>
-              <w:t xml:space="preserve"> (http://www.edupub.gov.lk/Administrator/English/7/English%20Reading%20Book%20G7/Unit%2010%20-%20Future%20-%20ok.pdf)</w:t>
-            </w:r>
-          </w:p>
-        </w:tc>
-      </w:tr>
-    </w:tbl>
-    <w:p/>
-    <w:p>
-      <w:pPr>
-        <w:pStyle w:val="Heading2"/>
-        <w:keepNext/>
-      </w:pPr>
-      <w:r>
-        <w:t xml:space="preserve">Grade 10 English Pupil's Book</w:t>
-      </w:r>
-    </w:p>
-    <w:p>
-      <w:pPr>
-        <w:keepNext/>
-      </w:pPr>
-      <w:r>
-        <w:t xml:space="preserve">The department publishes this book one unit at a time.</w:t>
-      </w:r>
-    </w:p>
-    <w:tbl>
-      <w:tblPr>
-        <w:tblW w:w="10106" w:type="dxa"/>
-        <w:tblBorders>
-          <w:top w:val="single" w:sz="4" w:space="0" w:color="8FA3BF"/>
-          <w:left w:val="single" w:sz="4" w:space="0" w:color="8FA3BF"/>
-          <w:bottom w:val="single" w:sz="4" w:space="0" w:color="8FA3BF"/>
-          <w:right w:val="single" w:sz="4" w:space="0" w:color="8FA3BF"/>
-          <w:insideH w:val="single" w:sz="4" w:space="0" w:color="8FA3BF"/>
-          <w:insideV w:val="single" w:sz="4" w:space="0" w:color="8FA3BF"/>
-        </w:tblBorders>
-        <w:tblLayout w:type="fixed"/>
-        <w:tblCellMar>
-          <w:left w:w="80" w:type="dxa"/>
-          <w:right w:w="80" w:type="dxa"/>
-        </w:tblCellMar>
-      </w:tblPr>
-      <w:tblGrid>
-        <w:gridCol w:w="7656"/>
-        <w:gridCol w:w="2450"/>
-      </w:tblGrid>
-      <w:tr>
-        <w:trPr>
-          <w:tblHeader/>
-          <w:cantSplit/>
-        </w:trPr>
-        <w:tc>
-          <w:tcPr>
-            <w:tcW w:w="7656" w:type="dxa"/>
-            <w:shd w:val="clear" w:color="auto" w:fill="DCE6F2"/>
-          </w:tcPr>
-          <w:p>
-            <w:pPr>
-              <w:pStyle w:val="TableText"/>
-            </w:pPr>
-            <w:r>
-              <w:rPr>
-                <w:b/>
-              </w:rPr>
-              <w:t xml:space="preserve">Unit</w:t>
-            </w:r>
-          </w:p>
-        </w:tc>
-        <w:tc>
-          <w:tcPr>
-            <w:tcW w:w="2450" w:type="dxa"/>
-            <w:shd w:val="clear" w:color="auto" w:fill="DCE6F2"/>
-          </w:tcPr>
-          <w:p>
-            <w:pPr>
-              <w:pStyle w:val="TableText"/>
-            </w:pPr>
-            <w:r>
-              <w:rPr>
-                <w:b/>
-              </w:rPr>
-              <w:t xml:space="preserve">Download</w:t>
-            </w:r>
-          </w:p>
-        </w:tc>
-      </w:tr>
-      <w:tr>
-        <w:trPr>
-          <w:cantSplit/>
-        </w:trPr>
-        <w:tc>
-          <w:tcPr>
-            <w:tcW w:w="7656" w:type="dxa"/>
-          </w:tcPr>
-          <w:p>
-            <w:pPr>
-              <w:pStyle w:val="TableText"/>
-            </w:pPr>
-            <w:r>
-              <w:t xml:space="preserve">Unit 1: People</w:t>
-            </w:r>
-          </w:p>
-        </w:tc>
-        <w:tc>
-          <w:tcPr>
-            <w:tcW w:w="2450" w:type="dxa"/>
-          </w:tcPr>
-          <w:p>
-            <w:pPr>
-              <w:pStyle w:val="TableText"/>
-            </w:pPr>
-            <w:r>
-              <w:t xml:space="preserve">PDF</w:t>
-            </w:r>
-            <w:r>
-              <w:rPr>
-                <w:sz w:val="18"/>
-              </w:rPr>
-              <w:t xml:space="preserve"> (http://www.edupub.gov.lk/Administrator/English/10/English%20Pupils%20Book%20G%2010%20-%20E/Unit%201%20pdf%20People.pdf)</w:t>
-            </w:r>
-          </w:p>
-        </w:tc>
-      </w:tr>
-      <w:tr>
-        <w:trPr>
-          <w:cantSplit/>
-        </w:trPr>
-        <w:tc>
-          <w:tcPr>
-            <w:tcW w:w="7656" w:type="dxa"/>
-          </w:tcPr>
-          <w:p>
-            <w:pPr>
-              <w:pStyle w:val="TableText"/>
-            </w:pPr>
-            <w:r>
-              <w:t xml:space="preserve">Unit 2: On Your Way</w:t>
-            </w:r>
-          </w:p>
-        </w:tc>
-        <w:tc>
-          <w:tcPr>
-            <w:tcW w:w="2450" w:type="dxa"/>
-          </w:tcPr>
-          <w:p>
-            <w:pPr>
-              <w:pStyle w:val="TableText"/>
-            </w:pPr>
-            <w:r>
-              <w:t xml:space="preserve">PDF</w:t>
-            </w:r>
-            <w:r>
-              <w:rPr>
-                <w:sz w:val="18"/>
-              </w:rPr>
-              <w:t xml:space="preserve"> (http://www.edupub.gov.lk/Administrator/English/10/English%20Pupils%20Book%20G%2010%20-%20E/Unit%202%20pdf%20ok%20on%20your%20way.pdf)</w:t>
-            </w:r>
-          </w:p>
-        </w:tc>
-      </w:tr>
-      <w:tr>
-        <w:trPr>
-          <w:cantSplit/>
-        </w:trPr>
-        <w:tc>
-          <w:tcPr>
-            <w:tcW w:w="7656" w:type="dxa"/>
-          </w:tcPr>
-          <w:p>
-            <w:pPr>
-              <w:pStyle w:val="TableText"/>
-            </w:pPr>
-            <w:r>
-              <w:t xml:space="preserve">Unit 3: Travel</w:t>
-            </w:r>
-          </w:p>
-        </w:tc>
-        <w:tc>
-          <w:tcPr>
-            <w:tcW w:w="2450" w:type="dxa"/>
-          </w:tcPr>
-          <w:p>
-            <w:pPr>
-              <w:pStyle w:val="TableText"/>
-            </w:pPr>
-            <w:r>
-              <w:t xml:space="preserve">PDF</w:t>
-            </w:r>
-            <w:r>
-              <w:rPr>
-                <w:sz w:val="18"/>
-              </w:rPr>
-              <w:t xml:space="preserve"> (http://www.edupub.gov.lk/Administrator/English/10/English%20Pupils%20Book%20G%2010%20-%20E/Unit%203%20Travel.pdf)</w:t>
-            </w:r>
-          </w:p>
-        </w:tc>
-      </w:tr>
-      <w:tr>
-        <w:trPr>
-          <w:cantSplit/>
-        </w:trPr>
-        <w:tc>
-          <w:tcPr>
-            <w:tcW w:w="7656" w:type="dxa"/>
-          </w:tcPr>
-          <w:p>
-            <w:pPr>
-              <w:pStyle w:val="TableText"/>
-            </w:pPr>
-            <w:r>
-              <w:t xml:space="preserve">Unit 4: Let's Talk</w:t>
-            </w:r>
-          </w:p>
-        </w:tc>
-        <w:tc>
-          <w:tcPr>
-            <w:tcW w:w="2450" w:type="dxa"/>
-          </w:tcPr>
-          <w:p>
-            <w:pPr>
-              <w:pStyle w:val="TableText"/>
-            </w:pPr>
-            <w:r>
-              <w:t xml:space="preserve">PDF</w:t>
-            </w:r>
-            <w:r>
-              <w:rPr>
-                <w:sz w:val="18"/>
-              </w:rPr>
-              <w:t xml:space="preserve"> (http://www.edupub.gov.lk/Administrator/English/10/English%20Pupils%20Book%20G%2010%20-%20E/Unit%204%20Lets%20talk.pdf)</w:t>
-            </w:r>
-          </w:p>
-        </w:tc>
-      </w:tr>
-      <w:tr>
-        <w:trPr>
-          <w:cantSplit/>
-        </w:trPr>
-        <w:tc>
-          <w:tcPr>
-            <w:tcW w:w="7656" w:type="dxa"/>
-          </w:tcPr>
-          <w:p>
-            <w:pPr>
-              <w:pStyle w:val="TableText"/>
-            </w:pPr>
-            <w:r>
-              <w:t xml:space="preserve">Unit 5: Best Practices</w:t>
-            </w:r>
-          </w:p>
-        </w:tc>
-        <w:tc>
-          <w:tcPr>
-            <w:tcW w:w="2450" w:type="dxa"/>
-          </w:tcPr>
-          <w:p>
-            <w:pPr>
-              <w:pStyle w:val="TableText"/>
-            </w:pPr>
-            <w:r>
-              <w:t xml:space="preserve">PDF</w:t>
-            </w:r>
-            <w:r>
-              <w:rPr>
-                <w:sz w:val="18"/>
-              </w:rPr>
-              <w:t xml:space="preserve"> (http://www.edupub.gov.lk/Administrator/English/10/English%20Pupils%20Book%20G%2010%20-%20E/Unit%205%20Best%20Practices.pdf)</w:t>
-            </w:r>
-          </w:p>
-        </w:tc>
-      </w:tr>
-      <w:tr>
-        <w:trPr>
-          <w:cantSplit/>
-        </w:trPr>
-        <w:tc>
-          <w:tcPr>
-            <w:tcW w:w="7656" w:type="dxa"/>
-          </w:tcPr>
-          <w:p>
-            <w:pPr>
-              <w:pStyle w:val="TableText"/>
-            </w:pPr>
-            <w:r>
-              <w:t xml:space="preserve">Unit 6: Information</w:t>
-            </w:r>
-          </w:p>
-        </w:tc>
-        <w:tc>
-          <w:tcPr>
-            <w:tcW w:w="2450" w:type="dxa"/>
-          </w:tcPr>
-          <w:p>
-            <w:pPr>
-              <w:pStyle w:val="TableText"/>
-            </w:pPr>
-            <w:r>
-              <w:t xml:space="preserve">PDF</w:t>
-            </w:r>
-            <w:r>
-              <w:rPr>
-                <w:sz w:val="18"/>
-              </w:rPr>
-              <w:t xml:space="preserve"> (http://www.edupub.gov.lk/Administrator/English/10/English%20Pupils%20Book%20G%2010%20-%20E/Unit%206%20Information.pdf)</w:t>
-            </w:r>
-          </w:p>
-        </w:tc>
-      </w:tr>
-      <w:tr>
-        <w:trPr>
-          <w:cantSplit/>
-        </w:trPr>
-        <w:tc>
-          <w:tcPr>
-            <w:tcW w:w="7656" w:type="dxa"/>
-          </w:tcPr>
-          <w:p>
-            <w:pPr>
-              <w:pStyle w:val="TableText"/>
-            </w:pPr>
-            <w:r>
-              <w:t xml:space="preserve">Unit 7: Learning Is Fun</w:t>
-            </w:r>
-          </w:p>
-        </w:tc>
-        <w:tc>
-          <w:tcPr>
-            <w:tcW w:w="2450" w:type="dxa"/>
-          </w:tcPr>
-          <w:p>
-            <w:pPr>
-              <w:pStyle w:val="TableText"/>
-            </w:pPr>
-            <w:r>
-              <w:t xml:space="preserve">PDF</w:t>
-            </w:r>
-            <w:r>
-              <w:rPr>
-                <w:sz w:val="18"/>
-              </w:rPr>
-              <w:t xml:space="preserve"> (http://www.edupub.gov.lk/Administrator/English/10/English%20Pupils%20Book%20G%2010%20-%20E/Unit%207%20Learning%20is%20fun.pdf)</w:t>
-            </w:r>
-          </w:p>
-        </w:tc>
-      </w:tr>
-      <w:tr>
-        <w:trPr>
-          <w:cantSplit/>
-        </w:trPr>
-        <w:tc>
-          <w:tcPr>
-            <w:tcW w:w="7656" w:type="dxa"/>
-          </w:tcPr>
-          <w:p>
-            <w:pPr>
-              <w:pStyle w:val="TableText"/>
-            </w:pPr>
-            <w:r>
-              <w:t xml:space="preserve">Unit 8: Healthy Food</w:t>
-            </w:r>
-          </w:p>
-        </w:tc>
-        <w:tc>
-          <w:tcPr>
-            <w:tcW w:w="2450" w:type="dxa"/>
-          </w:tcPr>
-          <w:p>
-            <w:pPr>
-              <w:pStyle w:val="TableText"/>
-            </w:pPr>
-            <w:r>
-              <w:t xml:space="preserve">PDF</w:t>
-            </w:r>
-            <w:r>
-              <w:rPr>
-                <w:sz w:val="18"/>
-              </w:rPr>
-              <w:t xml:space="preserve"> (http://www.edupub.gov.lk/Administrator/English/10/English%20Pupils%20Book%20G%2010%20-%20E/Unit%208%20Healthy%20Food.pdf)</w:t>
-            </w:r>
-          </w:p>
-        </w:tc>
-      </w:tr>
-      <w:tr>
-        <w:trPr>
-          <w:cantSplit/>
-        </w:trPr>
-        <w:tc>
-          <w:tcPr>
-            <w:tcW w:w="7656" w:type="dxa"/>
-          </w:tcPr>
-          <w:p>
-            <w:pPr>
-              <w:pStyle w:val="TableText"/>
-            </w:pPr>
-            <w:r>
-              <w:t xml:space="preserve">Unit 9: Nature</w:t>
-            </w:r>
-          </w:p>
-        </w:tc>
-        <w:tc>
-          <w:tcPr>
-            <w:tcW w:w="2450" w:type="dxa"/>
-          </w:tcPr>
-          <w:p>
-            <w:pPr>
-              <w:pStyle w:val="TableText"/>
-            </w:pPr>
-            <w:r>
-              <w:t xml:space="preserve">PDF</w:t>
-            </w:r>
-            <w:r>
-              <w:rPr>
-                <w:sz w:val="18"/>
-              </w:rPr>
-              <w:t xml:space="preserve"> (http://www.edupub.gov.lk/Administrator/English/10/English%20Pupils%20Book%20G%2010%20-%20E/Unit%209%20Nature.pdf)</w:t>
-            </w:r>
-          </w:p>
-        </w:tc>
-      </w:tr>
-      <w:tr>
-        <w:trPr>
-          <w:cantSplit/>
-        </w:trPr>
-        <w:tc>
-          <w:tcPr>
-            <w:tcW w:w="7656" w:type="dxa"/>
-          </w:tcPr>
-          <w:p>
-            <w:pPr>
-              <w:pStyle w:val="TableText"/>
-            </w:pPr>
-            <w:r>
-              <w:t xml:space="preserve">Unit 10: Personality</w:t>
-            </w:r>
-          </w:p>
-        </w:tc>
-        <w:tc>
-          <w:tcPr>
-            <w:tcW w:w="2450" w:type="dxa"/>
-          </w:tcPr>
-          <w:p>
-            <w:pPr>
-              <w:pStyle w:val="TableText"/>
-            </w:pPr>
-            <w:r>
-              <w:t xml:space="preserve">PDF</w:t>
-            </w:r>
-            <w:r>
-              <w:rPr>
-                <w:sz w:val="18"/>
-              </w:rPr>
-              <w:t xml:space="preserve"> (http://www.edupub.gov.lk/Administrator/English/10/English%20Pupils%20Book%20G%2010%20-%20E/Unit%2010%20Personality.pdf)</w:t>
-            </w:r>
-          </w:p>
-        </w:tc>
-      </w:tr>
-      <w:tr>
-        <w:trPr>
-          <w:cantSplit/>
-        </w:trPr>
-        <w:tc>
-          <w:tcPr>
-            <w:tcW w:w="7656" w:type="dxa"/>
-          </w:tcPr>
-          <w:p>
-            <w:pPr>
-              <w:pStyle w:val="TableText"/>
-            </w:pPr>
-            <w:r>
-              <w:t xml:space="preserve">Unit 11: The Right Career</w:t>
-            </w:r>
-          </w:p>
-        </w:tc>
-        <w:tc>
-          <w:tcPr>
-            <w:tcW w:w="2450" w:type="dxa"/>
-          </w:tcPr>
-          <w:p>
-            <w:pPr>
-              <w:pStyle w:val="TableText"/>
-            </w:pPr>
-            <w:r>
-              <w:t xml:space="preserve">PDF</w:t>
-            </w:r>
-            <w:r>
-              <w:rPr>
-                <w:sz w:val="18"/>
-              </w:rPr>
-              <w:t xml:space="preserve"> (http://www.edupub.gov.lk/Administrator/English/10/English%20Pupils%20Book%20G%2010%20-%20E/Unit%2011%20The%20right%20career.pdf)</w:t>
-            </w:r>
-          </w:p>
-        </w:tc>
-      </w:tr>
-      <w:tr>
-        <w:trPr>
-          <w:cantSplit/>
-        </w:trPr>
-        <w:tc>
-          <w:tcPr>
-            <w:tcW w:w="7656" w:type="dxa"/>
-          </w:tcPr>
-          <w:p>
-            <w:pPr>
-              <w:pStyle w:val="TableText"/>
-            </w:pPr>
-            <w:r>
-              <w:t xml:space="preserve">Unit 12: Success</w:t>
-            </w:r>
-          </w:p>
-        </w:tc>
-        <w:tc>
-          <w:tcPr>
-            <w:tcW w:w="2450" w:type="dxa"/>
-          </w:tcPr>
-          <w:p>
-            <w:pPr>
-              <w:pStyle w:val="TableText"/>
-            </w:pPr>
-            <w:r>
-              <w:t xml:space="preserve">PDF</w:t>
-            </w:r>
-            <w:r>
-              <w:rPr>
-                <w:sz w:val="18"/>
-              </w:rPr>
-              <w:t xml:space="preserve"> (http://www.edupub.gov.lk/Administrator/English/10/English%20Pupils%20Book%20G%2010%20-%20E/Unit%2012%20Success.pdf)</w:t>
-            </w:r>
-          </w:p>
-        </w:tc>
-      </w:tr>
-      <w:tr>
-        <w:trPr>
-          <w:cantSplit/>
-        </w:trPr>
-        <w:tc>
-          <w:tcPr>
-            <w:tcW w:w="7656" w:type="dxa"/>
-          </w:tcPr>
-          <w:p>
-            <w:pPr>
-              <w:pStyle w:val="TableText"/>
-            </w:pPr>
-            <w:r>
-              <w:t xml:space="preserve">Unit 13: Future</w:t>
-            </w:r>
-          </w:p>
-        </w:tc>
-        <w:tc>
-          <w:tcPr>
-            <w:tcW w:w="2450" w:type="dxa"/>
-          </w:tcPr>
-          <w:p>
-            <w:pPr>
-              <w:pStyle w:val="TableText"/>
-            </w:pPr>
-            <w:r>
-              <w:t xml:space="preserve">PDF</w:t>
-            </w:r>
-            <w:r>
-              <w:rPr>
-                <w:sz w:val="18"/>
-              </w:rPr>
-              <w:t xml:space="preserve"> (http://www.edupub.gov.lk/Administrator/English/10/English%20Pupils%20Book%20G%2010%20-%20E/Unit%2013%20Future.pdf)</w:t>
-            </w:r>
-          </w:p>
-        </w:tc>
-      </w:tr>
-      <w:tr>
-        <w:trPr>
-          <w:cantSplit/>
-        </w:trPr>
-        <w:tc>
-          <w:tcPr>
-            <w:tcW w:w="7656" w:type="dxa"/>
-          </w:tcPr>
-          <w:p>
-            <w:pPr>
-              <w:pStyle w:val="TableText"/>
-            </w:pPr>
-            <w:r>
-              <w:t xml:space="preserve">Unit 14: Sports</w:t>
-            </w:r>
-          </w:p>
-        </w:tc>
-        <w:tc>
-          <w:tcPr>
-            <w:tcW w:w="2450" w:type="dxa"/>
-          </w:tcPr>
-          <w:p>
-            <w:pPr>
-              <w:pStyle w:val="TableText"/>
-            </w:pPr>
-            <w:r>
-              <w:t xml:space="preserve">PDF</w:t>
-            </w:r>
-            <w:r>
-              <w:rPr>
-                <w:sz w:val="18"/>
-              </w:rPr>
-              <w:t xml:space="preserve"> (http://www.edupub.gov.lk/Administrator/English/10/English%20Pupils%20Book%20G%2010%20-%20E/Unit%2014%20Sports.pdf)</w:t>
             </w:r>
           </w:p>
         </w:tc>
@@ -3790,8 +2651,8 @@
         </w:tblCellMar>
       </w:tblPr>
       <w:tblGrid>
-        <w:gridCol w:w="3655"/>
-        <w:gridCol w:w="6451"/>
+        <w:gridCol w:w="3368"/>
+        <w:gridCol w:w="6738"/>
       </w:tblGrid>
       <w:tr>
         <w:trPr>
@@ -3800,7 +2661,7 @@
         </w:trPr>
         <w:tc>
           <w:tcPr>
-            <w:tcW w:w="3655" w:type="dxa"/>
+            <w:tcW w:w="3368" w:type="dxa"/>
             <w:shd w:val="clear" w:color="auto" w:fill="DCE6F2"/>
           </w:tcPr>
           <w:p>
@@ -3817,7 +2678,7 @@
         </w:tc>
         <w:tc>
           <w:tcPr>
-            <w:tcW w:w="6451" w:type="dxa"/>
+            <w:tcW w:w="6738" w:type="dxa"/>
             <w:shd w:val="clear" w:color="auto" w:fill="DCE6F2"/>
           </w:tcPr>
           <w:p>
@@ -3839,7 +2700,7 @@
         </w:trPr>
         <w:tc>
           <w:tcPr>
-            <w:tcW w:w="3655" w:type="dxa"/>
+            <w:tcW w:w="3368" w:type="dxa"/>
           </w:tcPr>
           <w:p>
             <w:pPr>
@@ -3852,7 +2713,7 @@
         </w:tc>
         <w:tc>
           <w:tcPr>
-            <w:tcW w:w="6451" w:type="dxa"/>
+            <w:tcW w:w="6738" w:type="dxa"/>
           </w:tcPr>
           <w:p>
             <w:pPr>
@@ -3870,69 +2731,69 @@
         </w:trPr>
         <w:tc>
           <w:tcPr>
-            <w:tcW w:w="3655" w:type="dxa"/>
-          </w:tcPr>
-          <w:p>
-            <w:pPr>
-              <w:pStyle w:val="TableText"/>
-            </w:pPr>
-            <w:r>
-              <w:t xml:space="preserve">Grade 7 Pupil's Book (whole book)</w:t>
-            </w:r>
-          </w:p>
-        </w:tc>
-        <w:tc>
-          <w:tcPr>
-            <w:tcW w:w="6451" w:type="dxa"/>
-          </w:tcPr>
-          <w:p>
-            <w:pPr>
-              <w:pStyle w:val="TableText"/>
-            </w:pPr>
-            <w:r>
-              <w:t xml:space="preserve">Only the Reading Book (unit by unit) and the Workbook are published.</w:t>
-            </w:r>
-          </w:p>
-        </w:tc>
-      </w:tr>
-      <w:tr>
-        <w:trPr>
-          <w:cantSplit/>
-        </w:trPr>
-        <w:tc>
-          <w:tcPr>
-            <w:tcW w:w="3655" w:type="dxa"/>
-          </w:tcPr>
-          <w:p>
-            <w:pPr>
-              <w:pStyle w:val="TableText"/>
-            </w:pPr>
-            <w:r>
-              <w:t xml:space="preserve">Grade 10 Pupil's Book (whole book)</w:t>
-            </w:r>
-          </w:p>
-        </w:tc>
-        <w:tc>
-          <w:tcPr>
-            <w:tcW w:w="6451" w:type="dxa"/>
-          </w:tcPr>
-          <w:p>
-            <w:pPr>
-              <w:pStyle w:val="TableText"/>
-            </w:pPr>
-            <w:r>
-              <w:t xml:space="preserve">Published unit by unit; the fourteen units are listed below.</w:t>
-            </w:r>
-          </w:p>
-        </w:tc>
-      </w:tr>
-      <w:tr>
-        <w:trPr>
-          <w:cantSplit/>
-        </w:trPr>
-        <w:tc>
-          <w:tcPr>
-            <w:tcW w:w="3655" w:type="dxa"/>
+            <w:tcW w:w="3368" w:type="dxa"/>
+          </w:tcPr>
+          <w:p>
+            <w:pPr>
+              <w:pStyle w:val="TableText"/>
+            </w:pPr>
+            <w:r>
+              <w:t xml:space="preserve">Grade 7 Pupil's Book</w:t>
+            </w:r>
+          </w:p>
+        </w:tc>
+        <w:tc>
+          <w:tcPr>
+            <w:tcW w:w="6738" w:type="dxa"/>
+          </w:tcPr>
+          <w:p>
+            <w:pPr>
+              <w:pStyle w:val="TableText"/>
+            </w:pPr>
+            <w:r>
+              <w:t xml:space="preserve">The department publishes it only one unit at a time, never as a whole book, so it is not listed here. The Workbook above is the complete book.</w:t>
+            </w:r>
+          </w:p>
+        </w:tc>
+      </w:tr>
+      <w:tr>
+        <w:trPr>
+          <w:cantSplit/>
+        </w:trPr>
+        <w:tc>
+          <w:tcPr>
+            <w:tcW w:w="3368" w:type="dxa"/>
+          </w:tcPr>
+          <w:p>
+            <w:pPr>
+              <w:pStyle w:val="TableText"/>
+            </w:pPr>
+            <w:r>
+              <w:t xml:space="preserve">Grade 10 Pupil's Book</w:t>
+            </w:r>
+          </w:p>
+        </w:tc>
+        <w:tc>
+          <w:tcPr>
+            <w:tcW w:w="6738" w:type="dxa"/>
+          </w:tcPr>
+          <w:p>
+            <w:pPr>
+              <w:pStyle w:val="TableText"/>
+            </w:pPr>
+            <w:r>
+              <w:t xml:space="preserve">The department publishes it only one unit at a time (fourteen separate files), never as a whole book, so it is not listed here.</w:t>
+            </w:r>
+          </w:p>
+        </w:tc>
+      </w:tr>
+      <w:tr>
+        <w:trPr>
+          <w:cantSplit/>
+        </w:trPr>
+        <w:tc>
+          <w:tcPr>
+            <w:tcW w:w="3368" w:type="dxa"/>
           </w:tcPr>
           <w:p>
             <w:pPr>
@@ -3945,7 +2806,7 @@
         </w:tc>
         <w:tc>
           <w:tcPr>
-            <w:tcW w:w="6451" w:type="dxa"/>
+            <w:tcW w:w="6738" w:type="dxa"/>
           </w:tcPr>
           <w:p>
             <w:pPr>
@@ -3963,7 +2824,7 @@
         </w:trPr>
         <w:tc>
           <w:tcPr>
-            <w:tcW w:w="3655" w:type="dxa"/>
+            <w:tcW w:w="3368" w:type="dxa"/>
           </w:tcPr>
           <w:p>
             <w:pPr>
@@ -3976,7 +2837,7 @@
         </w:tc>
         <w:tc>
           <w:tcPr>
-            <w:tcW w:w="6451" w:type="dxa"/>
+            <w:tcW w:w="6738" w:type="dxa"/>
           </w:tcPr>
           <w:p>
             <w:pPr>
@@ -3994,7 +2855,7 @@
         </w:trPr>
         <w:tc>
           <w:tcPr>
-            <w:tcW w:w="3655" w:type="dxa"/>
+            <w:tcW w:w="3368" w:type="dxa"/>
           </w:tcPr>
           <w:p>
             <w:pPr>
@@ -4007,7 +2868,7 @@
         </w:tc>
         <w:tc>
           <w:tcPr>
-            <w:tcW w:w="6451" w:type="dxa"/>
+            <w:tcW w:w="6738" w:type="dxa"/>
           </w:tcPr>
           <w:p>
             <w:pPr>

</xml_diff>

<commit_message>
Add Pick of the Day, refresh What's New, list the Grade 7 and 10 books
- Grade 7 Pupil's Book and Grade 10 Pupil's Book (scanned copy) now link the
  owner's Drive uploads; the department never published either as a whole
  book, so they have no department link beside them
- Pick of the Day: one of 35 curated resources on the home page, chosen by
  the date so everyone sees the same one and it changes at midnight. Shown
  once a day, closes with the button, Escape or a click outside, and can be
  turned off for good. Only the date last seen is stored, in the browser.
  The day steps by a stride coprime with the list length, so consecutive days
  move between audiences instead of showing three primary pages in a row.
- What's New: six entries for this month's teacher resources, each dated from
  the day the page actually went live
- tools/make-picks.js builds the pick list and refuses any URL that is not a
  real built page

Co-Authored-By: Claude Opus 5 <noreply@anthropic.com>
</commit_message>
<xml_diff>
--- a/assets/downloads/teacher/rcf-english-textbooks-and-teacher-guides.docx
+++ b/assets/downloads/teacher/rcf-english-textbooks-and-teacher-guides.docx
@@ -976,6 +976,68 @@
               <w:pStyle w:val="TableText"/>
             </w:pPr>
             <w:r>
+              <w:t xml:space="preserve">Pupil's Book</w:t>
+            </w:r>
+          </w:p>
+        </w:tc>
+        <w:tc>
+          <w:tcPr>
+            <w:tcW w:w="5680" w:type="dxa"/>
+          </w:tcPr>
+          <w:p>
+            <w:pPr>
+              <w:pStyle w:val="TableText"/>
+            </w:pPr>
+            <w:r>
+              <w:t xml:space="preserve">Download Pupil's Book (PDF)</w:t>
+            </w:r>
+            <w:r>
+              <w:rPr>
+                <w:sz w:val="18"/>
+              </w:rPr>
+              <w:t xml:space="preserve"> (https://drive.google.com/uc?export=download&amp;id=12L0ScUF3RSINuvZdVrsK7hU7Ur8N9AlW)</w:t>
+            </w:r>
+            <w:r>
+              <w:t xml:space="preserve"> · </w:t>
+            </w:r>
+            <w:r>
+              <w:t xml:space="preserve">read online</w:t>
+            </w:r>
+            <w:r>
+              <w:rPr>
+                <w:sz w:val="18"/>
+              </w:rPr>
+              <w:t xml:space="preserve"> (https://drive.google.com/file/d/12L0ScUF3RSINuvZdVrsK7hU7Ur8N9AlW/view)</w:t>
+            </w:r>
+          </w:p>
+        </w:tc>
+      </w:tr>
+      <w:tr>
+        <w:trPr>
+          <w:cantSplit/>
+        </w:trPr>
+        <w:tc>
+          <w:tcPr>
+            <w:tcW w:w="769" w:type="dxa"/>
+          </w:tcPr>
+          <w:p>
+            <w:pPr>
+              <w:pStyle w:val="TableText"/>
+            </w:pPr>
+            <w:r>
+              <w:t xml:space="preserve">Grade 7</w:t>
+            </w:r>
+          </w:p>
+        </w:tc>
+        <w:tc>
+          <w:tcPr>
+            <w:tcW w:w="3657" w:type="dxa"/>
+          </w:tcPr>
+          <w:p>
+            <w:pPr>
+              <w:pStyle w:val="TableText"/>
+            </w:pPr>
+            <w:r>
               <w:t xml:space="preserve">Workbook</w:t>
             </w:r>
           </w:p>
@@ -1220,6 +1282,68 @@
                 <w:sz w:val="18"/>
               </w:rPr>
               <w:t xml:space="preserve"> (http://www.edupub.gov.lk/Administrator/English/9/en%20wb%20g-9/en%20wb%20g-9.pdf)</w:t>
+            </w:r>
+          </w:p>
+        </w:tc>
+      </w:tr>
+      <w:tr>
+        <w:trPr>
+          <w:cantSplit/>
+        </w:trPr>
+        <w:tc>
+          <w:tcPr>
+            <w:tcW w:w="769" w:type="dxa"/>
+          </w:tcPr>
+          <w:p>
+            <w:pPr>
+              <w:pStyle w:val="TableText"/>
+            </w:pPr>
+            <w:r>
+              <w:t xml:space="preserve">Grade 10</w:t>
+            </w:r>
+          </w:p>
+        </w:tc>
+        <w:tc>
+          <w:tcPr>
+            <w:tcW w:w="3657" w:type="dxa"/>
+          </w:tcPr>
+          <w:p>
+            <w:pPr>
+              <w:pStyle w:val="TableText"/>
+            </w:pPr>
+            <w:r>
+              <w:t xml:space="preserve">Pupil's Book (scanned copy)</w:t>
+            </w:r>
+          </w:p>
+        </w:tc>
+        <w:tc>
+          <w:tcPr>
+            <w:tcW w:w="5680" w:type="dxa"/>
+          </w:tcPr>
+          <w:p>
+            <w:pPr>
+              <w:pStyle w:val="TableText"/>
+            </w:pPr>
+            <w:r>
+              <w:t xml:space="preserve">Download Pupil's Book (scanned copy) (PDF)</w:t>
+            </w:r>
+            <w:r>
+              <w:rPr>
+                <w:sz w:val="18"/>
+              </w:rPr>
+              <w:t xml:space="preserve"> (https://drive.google.com/uc?export=download&amp;id=1H5WeTVEAtNjvfXpO6iupB9ei58z8TJrx)</w:t>
+            </w:r>
+            <w:r>
+              <w:t xml:space="preserve"> · </w:t>
+            </w:r>
+            <w:r>
+              <w:t xml:space="preserve">read online</w:t>
+            </w:r>
+            <w:r>
+              <w:rPr>
+                <w:sz w:val="18"/>
+              </w:rPr>
+              <w:t xml:space="preserve"> (https://drive.google.com/file/d/1H5WeTVEAtNjvfXpO6iupB9ei58z8TJrx/view)</w:t>
             </w:r>
           </w:p>
         </w:tc>
@@ -2651,8 +2775,8 @@
         </w:tblCellMar>
       </w:tblPr>
       <w:tblGrid>
-        <w:gridCol w:w="3368"/>
-        <w:gridCol w:w="6738"/>
+        <w:gridCol w:w="5010"/>
+        <w:gridCol w:w="5096"/>
       </w:tblGrid>
       <w:tr>
         <w:trPr>
@@ -2661,7 +2785,7 @@
         </w:trPr>
         <w:tc>
           <w:tcPr>
-            <w:tcW w:w="3368" w:type="dxa"/>
+            <w:tcW w:w="5010" w:type="dxa"/>
             <w:shd w:val="clear" w:color="auto" w:fill="DCE6F2"/>
           </w:tcPr>
           <w:p>
@@ -2678,7 +2802,7 @@
         </w:tc>
         <w:tc>
           <w:tcPr>
-            <w:tcW w:w="6738" w:type="dxa"/>
+            <w:tcW w:w="5096" w:type="dxa"/>
             <w:shd w:val="clear" w:color="auto" w:fill="DCE6F2"/>
           </w:tcPr>
           <w:p>
@@ -2700,7 +2824,7 @@
         </w:trPr>
         <w:tc>
           <w:tcPr>
-            <w:tcW w:w="3368" w:type="dxa"/>
+            <w:tcW w:w="5010" w:type="dxa"/>
           </w:tcPr>
           <w:p>
             <w:pPr>
@@ -2713,7 +2837,7 @@
         </w:tc>
         <w:tc>
           <w:tcPr>
-            <w:tcW w:w="6738" w:type="dxa"/>
+            <w:tcW w:w="5096" w:type="dxa"/>
           </w:tcPr>
           <w:p>
             <w:pPr>
@@ -2731,69 +2855,38 @@
         </w:trPr>
         <w:tc>
           <w:tcPr>
-            <w:tcW w:w="3368" w:type="dxa"/>
-          </w:tcPr>
-          <w:p>
-            <w:pPr>
-              <w:pStyle w:val="TableText"/>
-            </w:pPr>
-            <w:r>
-              <w:t xml:space="preserve">Grade 7 Pupil's Book</w:t>
-            </w:r>
-          </w:p>
-        </w:tc>
-        <w:tc>
-          <w:tcPr>
-            <w:tcW w:w="6738" w:type="dxa"/>
-          </w:tcPr>
-          <w:p>
-            <w:pPr>
-              <w:pStyle w:val="TableText"/>
-            </w:pPr>
-            <w:r>
-              <w:t xml:space="preserve">The department publishes it only one unit at a time, never as a whole book, so it is not listed here. The Workbook above is the complete book.</w:t>
-            </w:r>
-          </w:p>
-        </w:tc>
-      </w:tr>
-      <w:tr>
-        <w:trPr>
-          <w:cantSplit/>
-        </w:trPr>
-        <w:tc>
-          <w:tcPr>
-            <w:tcW w:w="3368" w:type="dxa"/>
-          </w:tcPr>
-          <w:p>
-            <w:pPr>
-              <w:pStyle w:val="TableText"/>
-            </w:pPr>
-            <w:r>
-              <w:t xml:space="preserve">Grade 10 Pupil's Book</w:t>
-            </w:r>
-          </w:p>
-        </w:tc>
-        <w:tc>
-          <w:tcPr>
-            <w:tcW w:w="6738" w:type="dxa"/>
-          </w:tcPr>
-          <w:p>
-            <w:pPr>
-              <w:pStyle w:val="TableText"/>
-            </w:pPr>
-            <w:r>
-              <w:t xml:space="preserve">The department publishes it only one unit at a time (fourteen separate files), never as a whole book, so it is not listed here.</w:t>
-            </w:r>
-          </w:p>
-        </w:tc>
-      </w:tr>
-      <w:tr>
-        <w:trPr>
-          <w:cantSplit/>
-        </w:trPr>
-        <w:tc>
-          <w:tcPr>
-            <w:tcW w:w="3368" w:type="dxa"/>
+            <w:tcW w:w="5010" w:type="dxa"/>
+          </w:tcPr>
+          <w:p>
+            <w:pPr>
+              <w:pStyle w:val="TableText"/>
+            </w:pPr>
+            <w:r>
+              <w:t xml:space="preserve">Grade 7 and Grade 10 Pupil's Books on the department's site</w:t>
+            </w:r>
+          </w:p>
+        </w:tc>
+        <w:tc>
+          <w:tcPr>
+            <w:tcW w:w="5096" w:type="dxa"/>
+          </w:tcPr>
+          <w:p>
+            <w:pPr>
+              <w:pStyle w:val="TableText"/>
+            </w:pPr>
+            <w:r>
+              <w:t xml:space="preserve">The department publishes these two only one unit at a time, never as a whole book. The complete books listed above are copies held in the RCF English Drive, which is why they have no department link beside them.</w:t>
+            </w:r>
+          </w:p>
+        </w:tc>
+      </w:tr>
+      <w:tr>
+        <w:trPr>
+          <w:cantSplit/>
+        </w:trPr>
+        <w:tc>
+          <w:tcPr>
+            <w:tcW w:w="5010" w:type="dxa"/>
           </w:tcPr>
           <w:p>
             <w:pPr>
@@ -2806,7 +2899,7 @@
         </w:tc>
         <w:tc>
           <w:tcPr>
-            <w:tcW w:w="6738" w:type="dxa"/>
+            <w:tcW w:w="5096" w:type="dxa"/>
           </w:tcPr>
           <w:p>
             <w:pPr>
@@ -2824,7 +2917,7 @@
         </w:trPr>
         <w:tc>
           <w:tcPr>
-            <w:tcW w:w="3368" w:type="dxa"/>
+            <w:tcW w:w="5010" w:type="dxa"/>
           </w:tcPr>
           <w:p>
             <w:pPr>
@@ -2837,7 +2930,7 @@
         </w:tc>
         <w:tc>
           <w:tcPr>
-            <w:tcW w:w="6738" w:type="dxa"/>
+            <w:tcW w:w="5096" w:type="dxa"/>
           </w:tcPr>
           <w:p>
             <w:pPr>
@@ -2855,7 +2948,7 @@
         </w:trPr>
         <w:tc>
           <w:tcPr>
-            <w:tcW w:w="3368" w:type="dxa"/>
+            <w:tcW w:w="5010" w:type="dxa"/>
           </w:tcPr>
           <w:p>
             <w:pPr>
@@ -2868,7 +2961,7 @@
         </w:tc>
         <w:tc>
           <w:tcPr>
-            <w:tcW w:w="6738" w:type="dxa"/>
+            <w:tcW w:w="5096" w:type="dxa"/>
           </w:tcPr>
           <w:p>
             <w:pPr>

</xml_diff>

<commit_message>
Add the Grade 8 and Grade 11 Pupil's Books
Both were already in the Drive; the owner has made them view-only public, so
they now carry Download and read online links like the rest. Twelve books are
now served, all from the Drive.

Co-Authored-By: Claude Opus 5 <noreply@anthropic.com>
</commit_message>
<xml_diff>
--- a/assets/downloads/teacher/rcf-english-textbooks-and-teacher-guides.docx
+++ b/assets/downloads/teacher/rcf-english-textbooks-and-teacher-guides.docx
@@ -648,6 +648,68 @@
               <w:pStyle w:val="TableText"/>
             </w:pPr>
             <w:r>
+              <w:t xml:space="preserve">Grade 8</w:t>
+            </w:r>
+          </w:p>
+        </w:tc>
+        <w:tc>
+          <w:tcPr>
+            <w:tcW w:w="3428" w:type="dxa"/>
+          </w:tcPr>
+          <w:p>
+            <w:pPr>
+              <w:pStyle w:val="TableText"/>
+            </w:pPr>
+            <w:r>
+              <w:t xml:space="preserve">Pupil's Book</w:t>
+            </w:r>
+          </w:p>
+        </w:tc>
+        <w:tc>
+          <w:tcPr>
+            <w:tcW w:w="5415" w:type="dxa"/>
+          </w:tcPr>
+          <w:p>
+            <w:pPr>
+              <w:pStyle w:val="TableText"/>
+            </w:pPr>
+            <w:r>
+              <w:t xml:space="preserve">Download Pupil's Book (PDF)</w:t>
+            </w:r>
+            <w:r>
+              <w:rPr>
+                <w:sz w:val="18"/>
+              </w:rPr>
+              <w:t xml:space="preserve"> (https://drive.usercontent.google.com/download?id=1Tp65gVlBCRXABpcULpujXtc5UAT6Nqzr&amp;export=download&amp;authuser=0)</w:t>
+            </w:r>
+            <w:r>
+              <w:t xml:space="preserve"> · </w:t>
+            </w:r>
+            <w:r>
+              <w:t xml:space="preserve">read online</w:t>
+            </w:r>
+            <w:r>
+              <w:rPr>
+                <w:sz w:val="18"/>
+              </w:rPr>
+              <w:t xml:space="preserve"> (https://drive.google.com/file/d/1Tp65gVlBCRXABpcULpujXtc5UAT6Nqzr/view)</w:t>
+            </w:r>
+          </w:p>
+        </w:tc>
+      </w:tr>
+      <w:tr>
+        <w:trPr>
+          <w:cantSplit/>
+        </w:trPr>
+        <w:tc>
+          <w:tcPr>
+            <w:tcW w:w="1263" w:type="dxa"/>
+          </w:tcPr>
+          <w:p>
+            <w:pPr>
+              <w:pStyle w:val="TableText"/>
+            </w:pPr>
+            <w:r>
               <w:t xml:space="preserve">Grade 9</w:t>
             </w:r>
           </w:p>
@@ -817,6 +879,68 @@
                 <w:sz w:val="18"/>
               </w:rPr>
               <w:t xml:space="preserve"> (https://drive.google.com/file/d/0B5Dat0QJWfuUN3U3ODRCLUNQVXc/view?resourcekey=0-NzCvpFm0a0cgjv-0Ksr9Ow)</w:t>
+            </w:r>
+          </w:p>
+        </w:tc>
+      </w:tr>
+      <w:tr>
+        <w:trPr>
+          <w:cantSplit/>
+        </w:trPr>
+        <w:tc>
+          <w:tcPr>
+            <w:tcW w:w="1263" w:type="dxa"/>
+          </w:tcPr>
+          <w:p>
+            <w:pPr>
+              <w:pStyle w:val="TableText"/>
+            </w:pPr>
+            <w:r>
+              <w:t xml:space="preserve">Grade 11</w:t>
+            </w:r>
+          </w:p>
+        </w:tc>
+        <w:tc>
+          <w:tcPr>
+            <w:tcW w:w="3428" w:type="dxa"/>
+          </w:tcPr>
+          <w:p>
+            <w:pPr>
+              <w:pStyle w:val="TableText"/>
+            </w:pPr>
+            <w:r>
+              <w:t xml:space="preserve">Pupil's Book</w:t>
+            </w:r>
+          </w:p>
+        </w:tc>
+        <w:tc>
+          <w:tcPr>
+            <w:tcW w:w="5415" w:type="dxa"/>
+          </w:tcPr>
+          <w:p>
+            <w:pPr>
+              <w:pStyle w:val="TableText"/>
+            </w:pPr>
+            <w:r>
+              <w:t xml:space="preserve">Download Pupil's Book (PDF)</w:t>
+            </w:r>
+            <w:r>
+              <w:rPr>
+                <w:sz w:val="18"/>
+              </w:rPr>
+              <w:t xml:space="preserve"> (https://drive.usercontent.google.com/download?id=1Tzl1n6QFrK55gbzaSmQMfWvhYO_V_70B&amp;export=download&amp;authuser=0)</w:t>
+            </w:r>
+            <w:r>
+              <w:t xml:space="preserve"> · </w:t>
+            </w:r>
+            <w:r>
+              <w:t xml:space="preserve">read online</w:t>
+            </w:r>
+            <w:r>
+              <w:rPr>
+                <w:sz w:val="18"/>
+              </w:rPr>
+              <w:t xml:space="preserve"> (https://drive.google.com/file/d/1Tzl1n6QFrK55gbzaSmQMfWvhYO_V_70B/view)</w:t>
             </w:r>
           </w:p>
         </w:tc>
@@ -1144,7 +1268,7 @@
               <w:pStyle w:val="TableText"/>
             </w:pPr>
             <w:r>
-              <w:t xml:space="preserve">Pupil's Book</w:t>
+              <w:t xml:space="preserve">Workbook</w:t>
             </w:r>
           </w:p>
         </w:tc>
@@ -1162,7 +1286,7 @@
               <w:pStyle w:val="TableText"/>
             </w:pPr>
             <w:r>
-              <w:t xml:space="preserve">Grade 8</w:t>
+              <w:t xml:space="preserve">Grade 9</w:t>
             </w:r>
           </w:p>
         </w:tc>
@@ -1193,7 +1317,7 @@
               <w:pStyle w:val="TableText"/>
             </w:pPr>
             <w:r>
-              <w:t xml:space="preserve">Grade 9</w:t>
+              <w:t xml:space="preserve">Grade 10</w:t>
             </w:r>
           </w:p>
         </w:tc>
@@ -1207,68 +1331,6 @@
             </w:pPr>
             <w:r>
               <w:t xml:space="preserve">Workbook</w:t>
-            </w:r>
-          </w:p>
-        </w:tc>
-      </w:tr>
-      <w:tr>
-        <w:trPr>
-          <w:cantSplit/>
-        </w:trPr>
-        <w:tc>
-          <w:tcPr>
-            <w:tcW w:w="2787" w:type="dxa"/>
-          </w:tcPr>
-          <w:p>
-            <w:pPr>
-              <w:pStyle w:val="TableText"/>
-            </w:pPr>
-            <w:r>
-              <w:t xml:space="preserve">Grade 10</w:t>
-            </w:r>
-          </w:p>
-        </w:tc>
-        <w:tc>
-          <w:tcPr>
-            <w:tcW w:w="7319" w:type="dxa"/>
-          </w:tcPr>
-          <w:p>
-            <w:pPr>
-              <w:pStyle w:val="TableText"/>
-            </w:pPr>
-            <w:r>
-              <w:t xml:space="preserve">Workbook</w:t>
-            </w:r>
-          </w:p>
-        </w:tc>
-      </w:tr>
-      <w:tr>
-        <w:trPr>
-          <w:cantSplit/>
-        </w:trPr>
-        <w:tc>
-          <w:tcPr>
-            <w:tcW w:w="2787" w:type="dxa"/>
-          </w:tcPr>
-          <w:p>
-            <w:pPr>
-              <w:pStyle w:val="TableText"/>
-            </w:pPr>
-            <w:r>
-              <w:t xml:space="preserve">Grade 11</w:t>
-            </w:r>
-          </w:p>
-        </w:tc>
-        <w:tc>
-          <w:tcPr>
-            <w:tcW w:w="7319" w:type="dxa"/>
-          </w:tcPr>
-          <w:p>
-            <w:pPr>
-              <w:pStyle w:val="TableText"/>
-            </w:pPr>
-            <w:r>
-              <w:t xml:space="preserve">Pupil's Book</w:t>
             </w:r>
           </w:p>
         </w:tc>

</xml_diff>